<commit_message>
Update technical specs with detailed AI algorithm documentation
Expanded Section 6 (AI/ML Capabilities) from ~500 words to ~3,000 words.
Each of the 22 algorithms now has full documentation including:
- Mathematical approach (z-score, cosine similarity, Levenshtein, etc.)
- Input/output specifications
- Scoring criteria with point breakdowns
- Integration points (auto-run on hotline, document upload, etc.)
- Cache TTL and endpoint paths
- Closure readiness 13-criteria table
- Claude API model, timeout, and prompt design

Regenerated Word document (55 KB, up from 49 KB).

Co-Authored-By: Claude Opus 4.6 (1M context) <noreply@anthropic.com>
</commit_message>
<xml_diff>
--- a/docs/OIG-ITS_Technical_Specification.docx
+++ b/docs/OIG-ITS_Technical_Specification.docx
@@ -8106,7 +8106,7 @@
         <w:spacing w:after="80"/>
       </w:pPr>
       <w:r>
-        <w:t>The system includes 22 AI algorithms across two categories: 18 algorithmic (rule-based/statistical) modules in src/lib/ai/ and 4 Claude LLM-powered endpoints.</w:t>
+        <w:t>The system includes 22 AI algorithms across two categories: 18 algorithmic (rule-based/statistical) modules implemented in pure TypeScript (src/lib/ai/) and 4 Claude LLM-powered endpoints using the Anthropic API. All algorithms are accessible via REST API and through the interactive AI Insights Dashboard (/dashboard/ai) with 7 tabbed sections.</w:t>
       </w:r>
     </w:p>
     <w:p>
@@ -8114,1589 +8114,711 @@
         <w:pStyle w:val="Heading2"/>
       </w:pPr>
       <w:r>
-        <w:t>Algorithmic Modules (src/lib/ai/)</w:t>
+        <w:t>6.1 Anomaly Detection (`src/lib/ai/anomaly-detection.ts`)</w:t>
       </w:r>
     </w:p>
-    <w:tbl>
-      <w:tblPr>
-        <w:tblStyle w:val="LightGrid-Accent1"/>
-        <w:tblW w:type="auto" w:w="0"/>
-        <w:jc w:val="left"/>
-        <w:tblLook w:firstColumn="1" w:firstRow="1" w:lastColumn="0" w:lastRow="0" w:noHBand="0" w:noVBand="1" w:val="04A0"/>
-      </w:tblPr>
-      <w:tblGrid>
-        <w:gridCol w:w="1872"/>
-        <w:gridCol w:w="1872"/>
-        <w:gridCol w:w="1872"/>
-        <w:gridCol w:w="1872"/>
-        <w:gridCol w:w="1872"/>
-      </w:tblGrid>
-      <w:tr>
-        <w:tc>
-          <w:tcPr>
-            <w:tcW w:type="dxa" w:w="1872"/>
-          </w:tcPr>
-          <w:p>
-            <w:pPr>
-              <w:spacing w:before="20" w:after="20"/>
-            </w:pPr>
-            <w:r>
-              <w:rPr>
-                <w:sz w:val="18"/>
-              </w:rPr>
-              <w:t>#</w:t>
-            </w:r>
-          </w:p>
-        </w:tc>
-        <w:tc>
-          <w:tcPr>
-            <w:tcW w:type="dxa" w:w="1872"/>
-          </w:tcPr>
-          <w:p>
-            <w:pPr>
-              <w:spacing w:before="20" w:after="20"/>
-            </w:pPr>
-            <w:r>
-              <w:rPr>
-                <w:sz w:val="18"/>
-              </w:rPr>
-              <w:t>Algorithm</w:t>
-            </w:r>
-          </w:p>
-        </w:tc>
-        <w:tc>
-          <w:tcPr>
-            <w:tcW w:type="dxa" w:w="1872"/>
-          </w:tcPr>
-          <w:p>
-            <w:pPr>
-              <w:spacing w:before="20" w:after="20"/>
-            </w:pPr>
-            <w:r>
-              <w:rPr>
-                <w:sz w:val="18"/>
-              </w:rPr>
-              <w:t>File</w:t>
-            </w:r>
-          </w:p>
-        </w:tc>
-        <w:tc>
-          <w:tcPr>
-            <w:tcW w:type="dxa" w:w="1872"/>
-          </w:tcPr>
-          <w:p>
-            <w:pPr>
-              <w:spacing w:before="20" w:after="20"/>
-            </w:pPr>
-            <w:r>
-              <w:rPr>
-                <w:sz w:val="18"/>
-              </w:rPr>
-              <w:t>SOW Ref</w:t>
-            </w:r>
-          </w:p>
-        </w:tc>
-        <w:tc>
-          <w:tcPr>
-            <w:tcW w:type="dxa" w:w="1872"/>
-          </w:tcPr>
-          <w:p>
-            <w:pPr>
-              <w:spacing w:before="20" w:after="20"/>
-            </w:pPr>
-            <w:r>
-              <w:rPr>
-                <w:sz w:val="18"/>
-              </w:rPr>
-              <w:t>Description</w:t>
-            </w:r>
-          </w:p>
-        </w:tc>
-      </w:tr>
-      <w:tr>
-        <w:tc>
-          <w:tcPr>
-            <w:tcW w:type="dxa" w:w="1872"/>
-          </w:tcPr>
-          <w:p>
-            <w:pPr>
-              <w:spacing w:before="20" w:after="20"/>
-            </w:pPr>
-            <w:r>
-              <w:rPr>
-                <w:sz w:val="18"/>
-              </w:rPr>
-              <w:t>1</w:t>
-            </w:r>
-          </w:p>
-        </w:tc>
-        <w:tc>
-          <w:tcPr>
-            <w:tcW w:type="dxa" w:w="1872"/>
-          </w:tcPr>
-          <w:p>
-            <w:pPr>
-              <w:spacing w:before="20" w:after="20"/>
-            </w:pPr>
-            <w:r>
-              <w:rPr>
-                <w:sz w:val="18"/>
-              </w:rPr>
-              <w:t>Anomaly Detection</w:t>
-            </w:r>
-          </w:p>
-        </w:tc>
-        <w:tc>
-          <w:tcPr>
-            <w:tcW w:type="dxa" w:w="1872"/>
-          </w:tcPr>
-          <w:p>
-            <w:pPr>
-              <w:spacing w:before="20" w:after="20"/>
-            </w:pPr>
-            <w:r>
-              <w:rPr>
-                <w:sz w:val="18"/>
-              </w:rPr>
-              <w:t>anomaly-detection.ts</w:t>
-            </w:r>
-          </w:p>
-        </w:tc>
-        <w:tc>
-          <w:tcPr>
-            <w:tcW w:type="dxa" w:w="1872"/>
-          </w:tcPr>
-          <w:p>
-            <w:pPr>
-              <w:spacing w:before="20" w:after="20"/>
-            </w:pPr>
-            <w:r>
-              <w:rPr>
-                <w:sz w:val="18"/>
-              </w:rPr>
-              <w:t>RRS24</w:t>
-            </w:r>
-          </w:p>
-        </w:tc>
-        <w:tc>
-          <w:tcPr>
-            <w:tcW w:type="dxa" w:w="1872"/>
-          </w:tcPr>
-          <w:p>
-            <w:pPr>
-              <w:spacing w:before="20" w:after="20"/>
-            </w:pPr>
-            <w:r>
-              <w:rPr>
-                <w:sz w:val="18"/>
-              </w:rPr>
-              <w:t>Statistical z-score analysis across case data to identify outlier patterns in timelines, financials, and activity</w:t>
-            </w:r>
-          </w:p>
-        </w:tc>
-      </w:tr>
-      <w:tr>
-        <w:tc>
-          <w:tcPr>
-            <w:tcW w:type="dxa" w:w="1872"/>
-          </w:tcPr>
-          <w:p>
-            <w:pPr>
-              <w:spacing w:before="20" w:after="20"/>
-            </w:pPr>
-            <w:r>
-              <w:rPr>
-                <w:sz w:val="18"/>
-              </w:rPr>
-              <w:t>2</w:t>
-            </w:r>
-          </w:p>
-        </w:tc>
-        <w:tc>
-          <w:tcPr>
-            <w:tcW w:type="dxa" w:w="1872"/>
-          </w:tcPr>
-          <w:p>
-            <w:pPr>
-              <w:spacing w:before="20" w:after="20"/>
-            </w:pPr>
-            <w:r>
-              <w:rPr>
-                <w:sz w:val="18"/>
-              </w:rPr>
-              <w:t>Risk Scoring</w:t>
-            </w:r>
-          </w:p>
-        </w:tc>
-        <w:tc>
-          <w:tcPr>
-            <w:tcW w:type="dxa" w:w="1872"/>
-          </w:tcPr>
-          <w:p>
-            <w:pPr>
-              <w:spacing w:before="20" w:after="20"/>
-            </w:pPr>
-            <w:r>
-              <w:rPr>
-                <w:sz w:val="18"/>
-              </w:rPr>
-              <w:t>risk-scoring.ts</w:t>
-            </w:r>
-          </w:p>
-        </w:tc>
-        <w:tc>
-          <w:tcPr>
-            <w:tcW w:type="dxa" w:w="1872"/>
-          </w:tcPr>
-          <w:p>
-            <w:pPr>
-              <w:spacing w:before="20" w:after="20"/>
-            </w:pPr>
-            <w:r>
-              <w:rPr>
-                <w:sz w:val="18"/>
-              </w:rPr>
-              <w:t>HWC1</w:t>
-            </w:r>
-          </w:p>
-        </w:tc>
-        <w:tc>
-          <w:tcPr>
-            <w:tcW w:type="dxa" w:w="1872"/>
-          </w:tcPr>
-          <w:p>
-            <w:pPr>
-              <w:spacing w:before="20" w:after="20"/>
-            </w:pPr>
-            <w:r>
-              <w:rPr>
-                <w:sz w:val="18"/>
-              </w:rPr>
-              <w:t>Keyword-weighted risk assessment for incoming complaints; outputs score (0-100), risk level, and contributing factors</w:t>
-            </w:r>
-          </w:p>
-        </w:tc>
-      </w:tr>
-      <w:tr>
-        <w:tc>
-          <w:tcPr>
-            <w:tcW w:type="dxa" w:w="1872"/>
-          </w:tcPr>
-          <w:p>
-            <w:pPr>
-              <w:spacing w:before="20" w:after="20"/>
-            </w:pPr>
-            <w:r>
-              <w:rPr>
-                <w:sz w:val="18"/>
-              </w:rPr>
-              <w:t>3</w:t>
-            </w:r>
-          </w:p>
-        </w:tc>
-        <w:tc>
-          <w:tcPr>
-            <w:tcW w:type="dxa" w:w="1872"/>
-          </w:tcPr>
-          <w:p>
-            <w:pPr>
-              <w:spacing w:before="20" w:after="20"/>
-            </w:pPr>
-            <w:r>
-              <w:rPr>
-                <w:sz w:val="18"/>
-              </w:rPr>
-              <w:t>Case Similarity</w:t>
-            </w:r>
-          </w:p>
-        </w:tc>
-        <w:tc>
-          <w:tcPr>
-            <w:tcW w:type="dxa" w:w="1872"/>
-          </w:tcPr>
-          <w:p>
-            <w:pPr>
-              <w:spacing w:before="20" w:after="20"/>
-            </w:pPr>
-            <w:r>
-              <w:rPr>
-                <w:sz w:val="18"/>
-              </w:rPr>
-              <w:t>case-similarity.ts</w:t>
-            </w:r>
-          </w:p>
-        </w:tc>
-        <w:tc>
-          <w:tcPr>
-            <w:tcW w:type="dxa" w:w="1872"/>
-          </w:tcPr>
-          <w:p>
-            <w:pPr>
-              <w:spacing w:before="20" w:after="20"/>
-            </w:pPr>
-            <w:r>
-              <w:rPr>
-                <w:sz w:val="18"/>
-              </w:rPr>
-              <w:t>CM4, RRS11</w:t>
-            </w:r>
-          </w:p>
-        </w:tc>
-        <w:tc>
-          <w:tcPr>
-            <w:tcW w:type="dxa" w:w="1872"/>
-          </w:tcPr>
-          <w:p>
-            <w:pPr>
-              <w:spacing w:before="20" w:after="20"/>
-            </w:pPr>
-            <w:r>
-              <w:rPr>
-                <w:sz w:val="18"/>
-              </w:rPr>
-              <w:t>Cosine similarity over case attributes (type, source, jurisdiction) to find related investigations</w:t>
-            </w:r>
-          </w:p>
-        </w:tc>
-      </w:tr>
-      <w:tr>
-        <w:tc>
-          <w:tcPr>
-            <w:tcW w:type="dxa" w:w="1872"/>
-          </w:tcPr>
-          <w:p>
-            <w:pPr>
-              <w:spacing w:before="20" w:after="20"/>
-            </w:pPr>
-            <w:r>
-              <w:rPr>
-                <w:sz w:val="18"/>
-              </w:rPr>
-              <w:t>4</w:t>
-            </w:r>
-          </w:p>
-        </w:tc>
-        <w:tc>
-          <w:tcPr>
-            <w:tcW w:type="dxa" w:w="1872"/>
-          </w:tcPr>
-          <w:p>
-            <w:pPr>
-              <w:spacing w:before="20" w:after="20"/>
-            </w:pPr>
-            <w:r>
-              <w:rPr>
-                <w:sz w:val="18"/>
-              </w:rPr>
-              <w:t>Entity Resolution</w:t>
-            </w:r>
-          </w:p>
-        </w:tc>
-        <w:tc>
-          <w:tcPr>
-            <w:tcW w:type="dxa" w:w="1872"/>
-          </w:tcPr>
-          <w:p>
-            <w:pPr>
-              <w:spacing w:before="20" w:after="20"/>
-            </w:pPr>
-            <w:r>
-              <w:rPr>
-                <w:sz w:val="18"/>
-              </w:rPr>
-              <w:t>entity-resolution.ts</w:t>
-            </w:r>
-          </w:p>
-        </w:tc>
-        <w:tc>
-          <w:tcPr>
-            <w:tcW w:type="dxa" w:w="1872"/>
-          </w:tcPr>
-          <w:p>
-            <w:pPr>
-              <w:spacing w:before="20" w:after="20"/>
-            </w:pPr>
-            <w:r>
-              <w:rPr>
-                <w:sz w:val="18"/>
-              </w:rPr>
-              <w:t>EF15, WPN16</w:t>
-            </w:r>
-          </w:p>
-        </w:tc>
-        <w:tc>
-          <w:tcPr>
-            <w:tcW w:type="dxa" w:w="1872"/>
-          </w:tcPr>
-          <w:p>
-            <w:pPr>
-              <w:spacing w:before="20" w:after="20"/>
-            </w:pPr>
-            <w:r>
-              <w:rPr>
-                <w:sz w:val="18"/>
-              </w:rPr>
-              <w:t>Levenshtein edit-distance matching to detect duplicate subjects across cases</w:t>
-            </w:r>
-          </w:p>
-        </w:tc>
-      </w:tr>
-      <w:tr>
-        <w:tc>
-          <w:tcPr>
-            <w:tcW w:type="dxa" w:w="1872"/>
-          </w:tcPr>
-          <w:p>
-            <w:pPr>
-              <w:spacing w:before="20" w:after="20"/>
-            </w:pPr>
-            <w:r>
-              <w:rPr>
-                <w:sz w:val="18"/>
-              </w:rPr>
-              <w:t>5</w:t>
-            </w:r>
-          </w:p>
-        </w:tc>
-        <w:tc>
-          <w:tcPr>
-            <w:tcW w:type="dxa" w:w="1872"/>
-          </w:tcPr>
-          <w:p>
-            <w:pPr>
-              <w:spacing w:before="20" w:after="20"/>
-            </w:pPr>
-            <w:r>
-              <w:rPr>
-                <w:sz w:val="18"/>
-              </w:rPr>
-              <w:t>Predictive Analytics</w:t>
-            </w:r>
-          </w:p>
-        </w:tc>
-        <w:tc>
-          <w:tcPr>
-            <w:tcW w:type="dxa" w:w="1872"/>
-          </w:tcPr>
-          <w:p>
-            <w:pPr>
-              <w:spacing w:before="20" w:after="20"/>
-            </w:pPr>
-            <w:r>
-              <w:rPr>
-                <w:sz w:val="18"/>
-              </w:rPr>
-              <w:t>predictions.ts</w:t>
-            </w:r>
-          </w:p>
-        </w:tc>
-        <w:tc>
-          <w:tcPr>
-            <w:tcW w:type="dxa" w:w="1872"/>
-          </w:tcPr>
-          <w:p>
-            <w:pPr>
-              <w:spacing w:before="20" w:after="20"/>
-            </w:pPr>
-            <w:r>
-              <w:rPr>
-                <w:sz w:val="18"/>
-              </w:rPr>
-              <w:t>RRS23</w:t>
-            </w:r>
-          </w:p>
-        </w:tc>
-        <w:tc>
-          <w:tcPr>
-            <w:tcW w:type="dxa" w:w="1872"/>
-          </w:tcPr>
-          <w:p>
-            <w:pPr>
-              <w:spacing w:before="20" w:after="20"/>
-            </w:pPr>
-            <w:r>
-              <w:rPr>
-                <w:sz w:val="18"/>
-              </w:rPr>
-              <w:t>Duration prediction, outcome probability, and caseload forecasting using historical data regression</w:t>
-            </w:r>
-          </w:p>
-        </w:tc>
-      </w:tr>
-      <w:tr>
-        <w:tc>
-          <w:tcPr>
-            <w:tcW w:type="dxa" w:w="1872"/>
-          </w:tcPr>
-          <w:p>
-            <w:pPr>
-              <w:spacing w:before="20" w:after="20"/>
-            </w:pPr>
-            <w:r>
-              <w:rPr>
-                <w:sz w:val="18"/>
-              </w:rPr>
-              <w:t>6</w:t>
-            </w:r>
-          </w:p>
-        </w:tc>
-        <w:tc>
-          <w:tcPr>
-            <w:tcW w:type="dxa" w:w="1872"/>
-          </w:tcPr>
-          <w:p>
-            <w:pPr>
-              <w:spacing w:before="20" w:after="20"/>
-            </w:pPr>
-            <w:r>
-              <w:rPr>
-                <w:sz w:val="18"/>
-              </w:rPr>
-              <w:t>Network Analysis</w:t>
-            </w:r>
-          </w:p>
-        </w:tc>
-        <w:tc>
-          <w:tcPr>
-            <w:tcW w:type="dxa" w:w="1872"/>
-          </w:tcPr>
-          <w:p>
-            <w:pPr>
-              <w:spacing w:before="20" w:after="20"/>
-            </w:pPr>
-            <w:r>
-              <w:rPr>
-                <w:sz w:val="18"/>
-              </w:rPr>
-              <w:t>network-analysis.ts</w:t>
-            </w:r>
-          </w:p>
-        </w:tc>
-        <w:tc>
-          <w:tcPr>
-            <w:tcW w:type="dxa" w:w="1872"/>
-          </w:tcPr>
-          <w:p>
-            <w:pPr>
-              <w:spacing w:before="20" w:after="20"/>
-            </w:pPr>
-            <w:r>
-              <w:rPr>
-                <w:sz w:val="18"/>
-              </w:rPr>
-              <w:t>CM49, CM4</w:t>
-            </w:r>
-          </w:p>
-        </w:tc>
-        <w:tc>
-          <w:tcPr>
-            <w:tcW w:type="dxa" w:w="1872"/>
-          </w:tcPr>
-          <w:p>
-            <w:pPr>
-              <w:spacing w:before="20" w:after="20"/>
-            </w:pPr>
-            <w:r>
-              <w:rPr>
-                <w:sz w:val="18"/>
-              </w:rPr>
-              <w:t>Graph-based analysis of subject-case relationships to identify fraud rings and high-connectivity nodes</w:t>
-            </w:r>
-          </w:p>
-        </w:tc>
-      </w:tr>
-      <w:tr>
-        <w:tc>
-          <w:tcPr>
-            <w:tcW w:type="dxa" w:w="1872"/>
-          </w:tcPr>
-          <w:p>
-            <w:pPr>
-              <w:spacing w:before="20" w:after="20"/>
-            </w:pPr>
-            <w:r>
-              <w:rPr>
-                <w:sz w:val="18"/>
-              </w:rPr>
-              <w:t>7</w:t>
-            </w:r>
-          </w:p>
-        </w:tc>
-        <w:tc>
-          <w:tcPr>
-            <w:tcW w:type="dxa" w:w="1872"/>
-          </w:tcPr>
-          <w:p>
-            <w:pPr>
-              <w:spacing w:before="20" w:after="20"/>
-            </w:pPr>
-            <w:r>
-              <w:rPr>
-                <w:sz w:val="18"/>
-              </w:rPr>
-              <w:t>Document Classifier</w:t>
-            </w:r>
-          </w:p>
-        </w:tc>
-        <w:tc>
-          <w:tcPr>
-            <w:tcW w:type="dxa" w:w="1872"/>
-          </w:tcPr>
-          <w:p>
-            <w:pPr>
-              <w:spacing w:before="20" w:after="20"/>
-            </w:pPr>
-            <w:r>
-              <w:rPr>
-                <w:sz w:val="18"/>
-              </w:rPr>
-              <w:t>document-classifier.ts</w:t>
-            </w:r>
-          </w:p>
-        </w:tc>
-        <w:tc>
-          <w:tcPr>
-            <w:tcW w:type="dxa" w:w="1872"/>
-          </w:tcPr>
-          <w:p>
-            <w:pPr>
-              <w:spacing w:before="20" w:after="20"/>
-            </w:pPr>
-            <w:r>
-              <w:rPr>
-                <w:sz w:val="18"/>
-              </w:rPr>
-              <w:t>DMR1, EF5</w:t>
-            </w:r>
-          </w:p>
-        </w:tc>
-        <w:tc>
-          <w:tcPr>
-            <w:tcW w:type="dxa" w:w="1872"/>
-          </w:tcPr>
-          <w:p>
-            <w:pPr>
-              <w:spacing w:before="20" w:after="20"/>
-            </w:pPr>
-            <w:r>
-              <w:rPr>
-                <w:sz w:val="18"/>
-              </w:rPr>
-              <w:t>Rule-based classification of documents into 11 categories with confidence scoring and tag generation</w:t>
-            </w:r>
-          </w:p>
-        </w:tc>
-      </w:tr>
-      <w:tr>
-        <w:tc>
-          <w:tcPr>
-            <w:tcW w:type="dxa" w:w="1872"/>
-          </w:tcPr>
-          <w:p>
-            <w:pPr>
-              <w:spacing w:before="20" w:after="20"/>
-            </w:pPr>
-            <w:r>
-              <w:rPr>
-                <w:sz w:val="18"/>
-              </w:rPr>
-              <w:t>8</w:t>
-            </w:r>
-          </w:p>
-        </w:tc>
-        <w:tc>
-          <w:tcPr>
-            <w:tcW w:type="dxa" w:w="1872"/>
-          </w:tcPr>
-          <w:p>
-            <w:pPr>
-              <w:spacing w:before="20" w:after="20"/>
-            </w:pPr>
-            <w:r>
-              <w:rPr>
-                <w:sz w:val="18"/>
-              </w:rPr>
-              <w:t>Investigator Recommender</w:t>
-            </w:r>
-          </w:p>
-        </w:tc>
-        <w:tc>
-          <w:tcPr>
-            <w:tcW w:type="dxa" w:w="1872"/>
-          </w:tcPr>
-          <w:p>
-            <w:pPr>
-              <w:spacing w:before="20" w:after="20"/>
-            </w:pPr>
-            <w:r>
-              <w:rPr>
-                <w:sz w:val="18"/>
-              </w:rPr>
-              <w:t>investigator-recommender.ts</w:t>
-            </w:r>
-          </w:p>
-        </w:tc>
-        <w:tc>
-          <w:tcPr>
-            <w:tcW w:type="dxa" w:w="1872"/>
-          </w:tcPr>
-          <w:p>
-            <w:pPr>
-              <w:spacing w:before="20" w:after="20"/>
-            </w:pPr>
-            <w:r>
-              <w:rPr>
-                <w:sz w:val="18"/>
-              </w:rPr>
-              <w:t>C17</w:t>
-            </w:r>
-          </w:p>
-        </w:tc>
-        <w:tc>
-          <w:tcPr>
-            <w:tcW w:type="dxa" w:w="1872"/>
-          </w:tcPr>
-          <w:p>
-            <w:pPr>
-              <w:spacing w:before="20" w:after="20"/>
-            </w:pPr>
-            <w:r>
-              <w:rPr>
-                <w:sz w:val="18"/>
-              </w:rPr>
-              <w:t>Workload-balanced investigator assignment recommendations based on expertise, caseload, and case type match</w:t>
-            </w:r>
-          </w:p>
-        </w:tc>
-      </w:tr>
-      <w:tr>
-        <w:tc>
-          <w:tcPr>
-            <w:tcW w:type="dxa" w:w="1872"/>
-          </w:tcPr>
-          <w:p>
-            <w:pPr>
-              <w:spacing w:before="20" w:after="20"/>
-            </w:pPr>
-            <w:r>
-              <w:rPr>
-                <w:sz w:val="18"/>
-              </w:rPr>
-              <w:t>9</w:t>
-            </w:r>
-          </w:p>
-        </w:tc>
-        <w:tc>
-          <w:tcPr>
-            <w:tcW w:type="dxa" w:w="1872"/>
-          </w:tcPr>
-          <w:p>
-            <w:pPr>
-              <w:spacing w:before="20" w:after="20"/>
-            </w:pPr>
-            <w:r>
-              <w:rPr>
-                <w:sz w:val="18"/>
-              </w:rPr>
-              <w:t>Auto-Escalation</w:t>
-            </w:r>
-          </w:p>
-        </w:tc>
-        <w:tc>
-          <w:tcPr>
-            <w:tcW w:type="dxa" w:w="1872"/>
-          </w:tcPr>
-          <w:p>
-            <w:pPr>
-              <w:spacing w:before="20" w:after="20"/>
-            </w:pPr>
-            <w:r>
-              <w:rPr>
-                <w:sz w:val="18"/>
-              </w:rPr>
-              <w:t>auto-escalation.ts</w:t>
-            </w:r>
-          </w:p>
-        </w:tc>
-        <w:tc>
-          <w:tcPr>
-            <w:tcW w:type="dxa" w:w="1872"/>
-          </w:tcPr>
-          <w:p>
-            <w:pPr>
-              <w:spacing w:before="20" w:after="20"/>
-            </w:pPr>
-            <w:r>
-              <w:rPr>
-                <w:sz w:val="18"/>
-              </w:rPr>
-              <w:t>WPN27</w:t>
-            </w:r>
-          </w:p>
-        </w:tc>
-        <w:tc>
-          <w:tcPr>
-            <w:tcW w:type="dxa" w:w="1872"/>
-          </w:tcPr>
-          <w:p>
-            <w:pPr>
-              <w:spacing w:before="20" w:after="20"/>
-            </w:pPr>
-            <w:r>
-              <w:rPr>
-                <w:sz w:val="18"/>
-              </w:rPr>
-              <w:t>Automated priority escalation recommendations for cases approaching deadlines or with overdue tasks</w:t>
-            </w:r>
-          </w:p>
-        </w:tc>
-      </w:tr>
-      <w:tr>
-        <w:tc>
-          <w:tcPr>
-            <w:tcW w:type="dxa" w:w="1872"/>
-          </w:tcPr>
-          <w:p>
-            <w:pPr>
-              <w:spacing w:before="20" w:after="20"/>
-            </w:pPr>
-            <w:r>
-              <w:rPr>
-                <w:sz w:val="18"/>
-              </w:rPr>
-              <w:t>10</w:t>
-            </w:r>
-          </w:p>
-        </w:tc>
-        <w:tc>
-          <w:tcPr>
-            <w:tcW w:type="dxa" w:w="1872"/>
-          </w:tcPr>
-          <w:p>
-            <w:pPr>
-              <w:spacing w:before="20" w:after="20"/>
-            </w:pPr>
-            <w:r>
-              <w:rPr>
-                <w:sz w:val="18"/>
-              </w:rPr>
-              <w:t>Evidence Strength</w:t>
-            </w:r>
-          </w:p>
-        </w:tc>
-        <w:tc>
-          <w:tcPr>
-            <w:tcW w:type="dxa" w:w="1872"/>
-          </w:tcPr>
-          <w:p>
-            <w:pPr>
-              <w:spacing w:before="20" w:after="20"/>
-            </w:pPr>
-            <w:r>
-              <w:rPr>
-                <w:sz w:val="18"/>
-              </w:rPr>
-              <w:t>evidence-strength.ts</w:t>
-            </w:r>
-          </w:p>
-        </w:tc>
-        <w:tc>
-          <w:tcPr>
-            <w:tcW w:type="dxa" w:w="1872"/>
-          </w:tcPr>
-          <w:p>
-            <w:pPr>
-              <w:spacing w:before="20" w:after="20"/>
-            </w:pPr>
-            <w:r>
-              <w:rPr>
-                <w:sz w:val="18"/>
-              </w:rPr>
-              <w:t>EF7</w:t>
-            </w:r>
-          </w:p>
-        </w:tc>
-        <w:tc>
-          <w:tcPr>
-            <w:tcW w:type="dxa" w:w="1872"/>
-          </w:tcPr>
-          <w:p>
-            <w:pPr>
-              <w:spacing w:before="20" w:after="20"/>
-            </w:pPr>
-            <w:r>
-              <w:rPr>
-                <w:sz w:val="18"/>
-              </w:rPr>
-              <w:t>Point-based evidence portfolio grading (A-F) based on diversity, volume, and chain-of-custody completeness</w:t>
-            </w:r>
-          </w:p>
-        </w:tc>
-      </w:tr>
-      <w:tr>
-        <w:tc>
-          <w:tcPr>
-            <w:tcW w:type="dxa" w:w="1872"/>
-          </w:tcPr>
-          <w:p>
-            <w:pPr>
-              <w:spacing w:before="20" w:after="20"/>
-            </w:pPr>
-            <w:r>
-              <w:rPr>
-                <w:sz w:val="18"/>
-              </w:rPr>
-              <w:t>11</w:t>
-            </w:r>
-          </w:p>
-        </w:tc>
-        <w:tc>
-          <w:tcPr>
-            <w:tcW w:type="dxa" w:w="1872"/>
-          </w:tcPr>
-          <w:p>
-            <w:pPr>
-              <w:spacing w:before="20" w:after="20"/>
-            </w:pPr>
-            <w:r>
-              <w:rPr>
-                <w:sz w:val="18"/>
-              </w:rPr>
-              <w:t>Complaint Deduplication</w:t>
-            </w:r>
-          </w:p>
-        </w:tc>
-        <w:tc>
-          <w:tcPr>
-            <w:tcW w:type="dxa" w:w="1872"/>
-          </w:tcPr>
-          <w:p>
-            <w:pPr>
-              <w:spacing w:before="20" w:after="20"/>
-            </w:pPr>
-            <w:r>
-              <w:rPr>
-                <w:sz w:val="18"/>
-              </w:rPr>
-              <w:t>complaint-dedup.ts</w:t>
-            </w:r>
-          </w:p>
-        </w:tc>
-        <w:tc>
-          <w:tcPr>
-            <w:tcW w:type="dxa" w:w="1872"/>
-          </w:tcPr>
-          <w:p>
-            <w:pPr>
-              <w:spacing w:before="20" w:after="20"/>
-            </w:pPr>
-            <w:r>
-              <w:rPr>
-                <w:sz w:val="18"/>
-              </w:rPr>
-              <w:t>EF15, HWC1</w:t>
-            </w:r>
-          </w:p>
-        </w:tc>
-        <w:tc>
-          <w:tcPr>
-            <w:tcW w:type="dxa" w:w="1872"/>
-          </w:tcPr>
-          <w:p>
-            <w:pPr>
-              <w:spacing w:before="20" w:after="20"/>
-            </w:pPr>
-            <w:r>
-              <w:rPr>
-                <w:sz w:val="18"/>
-              </w:rPr>
-              <w:t>Keyword overlap and Levenshtein matching to identify duplicate complaints across inquiries and cases</w:t>
-            </w:r>
-          </w:p>
-        </w:tc>
-      </w:tr>
-      <w:tr>
-        <w:tc>
-          <w:tcPr>
-            <w:tcW w:type="dxa" w:w="1872"/>
-          </w:tcPr>
-          <w:p>
-            <w:pPr>
-              <w:spacing w:before="20" w:after="20"/>
-            </w:pPr>
-            <w:r>
-              <w:rPr>
-                <w:sz w:val="18"/>
-              </w:rPr>
-              <w:t>12</w:t>
-            </w:r>
-          </w:p>
-        </w:tc>
-        <w:tc>
-          <w:tcPr>
-            <w:tcW w:type="dxa" w:w="1872"/>
-          </w:tcPr>
-          <w:p>
-            <w:pPr>
-              <w:spacing w:before="20" w:after="20"/>
-            </w:pPr>
-            <w:r>
-              <w:rPr>
-                <w:sz w:val="18"/>
-              </w:rPr>
-              <w:t>Timeline Anomalies</w:t>
-            </w:r>
-          </w:p>
-        </w:tc>
-        <w:tc>
-          <w:tcPr>
-            <w:tcW w:type="dxa" w:w="1872"/>
-          </w:tcPr>
-          <w:p>
-            <w:pPr>
-              <w:spacing w:before="20" w:after="20"/>
-            </w:pPr>
-            <w:r>
-              <w:rPr>
-                <w:sz w:val="18"/>
-              </w:rPr>
-              <w:t>timeline-anomalies.ts</w:t>
-            </w:r>
-          </w:p>
-        </w:tc>
-        <w:tc>
-          <w:tcPr>
-            <w:tcW w:type="dxa" w:w="1872"/>
-          </w:tcPr>
-          <w:p>
-            <w:pPr>
-              <w:spacing w:before="20" w:after="20"/>
-            </w:pPr>
-            <w:r>
-              <w:rPr>
-                <w:sz w:val="18"/>
-              </w:rPr>
-              <w:t>CM34</w:t>
-            </w:r>
-          </w:p>
-        </w:tc>
-        <w:tc>
-          <w:tcPr>
-            <w:tcW w:type="dxa" w:w="1872"/>
-          </w:tcPr>
-          <w:p>
-            <w:pPr>
-              <w:spacing w:before="20" w:after="20"/>
-            </w:pPr>
-            <w:r>
-              <w:rPr>
-                <w:sz w:val="18"/>
-              </w:rPr>
-              <w:t>Detection of suspicious activity patterns (weekend activity, after-hours, rapid sequences, large gaps)</w:t>
-            </w:r>
-          </w:p>
-        </w:tc>
-      </w:tr>
-      <w:tr>
-        <w:tc>
-          <w:tcPr>
-            <w:tcW w:type="dxa" w:w="1872"/>
-          </w:tcPr>
-          <w:p>
-            <w:pPr>
-              <w:spacing w:before="20" w:after="20"/>
-            </w:pPr>
-            <w:r>
-              <w:rPr>
-                <w:sz w:val="18"/>
-              </w:rPr>
-              <w:t>13</w:t>
-            </w:r>
-          </w:p>
-        </w:tc>
-        <w:tc>
-          <w:tcPr>
-            <w:tcW w:type="dxa" w:w="1872"/>
-          </w:tcPr>
-          <w:p>
-            <w:pPr>
-              <w:spacing w:before="20" w:after="20"/>
-            </w:pPr>
-            <w:r>
-              <w:rPr>
-                <w:sz w:val="18"/>
-              </w:rPr>
-              <w:t>Workload Balancing</w:t>
-            </w:r>
-          </w:p>
-        </w:tc>
-        <w:tc>
-          <w:tcPr>
-            <w:tcW w:type="dxa" w:w="1872"/>
-          </w:tcPr>
-          <w:p>
-            <w:pPr>
-              <w:spacing w:before="20" w:after="20"/>
-            </w:pPr>
-            <w:r>
-              <w:rPr>
-                <w:sz w:val="18"/>
-              </w:rPr>
-              <w:t>workload-balancing.ts</w:t>
-            </w:r>
-          </w:p>
-        </w:tc>
-        <w:tc>
-          <w:tcPr>
-            <w:tcW w:type="dxa" w:w="1872"/>
-          </w:tcPr>
-          <w:p>
-            <w:pPr>
-              <w:spacing w:before="20" w:after="20"/>
-            </w:pPr>
-            <w:r>
-              <w:rPr>
-                <w:sz w:val="18"/>
-              </w:rPr>
-              <w:t>RRS23, C17</w:t>
-            </w:r>
-          </w:p>
-        </w:tc>
-        <w:tc>
-          <w:tcPr>
-            <w:tcW w:type="dxa" w:w="1872"/>
-          </w:tcPr>
-          <w:p>
-            <w:pPr>
-              <w:spacing w:before="20" w:after="20"/>
-            </w:pPr>
-            <w:r>
-              <w:rPr>
-                <w:sz w:val="18"/>
-              </w:rPr>
-              <w:t>Real-time workload scoring per investigator considering active cases, overdue tasks, and critical case count</w:t>
-            </w:r>
-          </w:p>
-        </w:tc>
-      </w:tr>
-      <w:tr>
-        <w:tc>
-          <w:tcPr>
-            <w:tcW w:type="dxa" w:w="1872"/>
-          </w:tcPr>
-          <w:p>
-            <w:pPr>
-              <w:spacing w:before="20" w:after="20"/>
-            </w:pPr>
-            <w:r>
-              <w:rPr>
-                <w:sz w:val="18"/>
-              </w:rPr>
-              <w:t>14</w:t>
-            </w:r>
-          </w:p>
-        </w:tc>
-        <w:tc>
-          <w:tcPr>
-            <w:tcW w:type="dxa" w:w="1872"/>
-          </w:tcPr>
-          <w:p>
-            <w:pPr>
-              <w:spacing w:before="20" w:after="20"/>
-            </w:pPr>
-            <w:r>
-              <w:rPr>
-                <w:sz w:val="18"/>
-              </w:rPr>
-              <w:t>Closure Readiness</w:t>
-            </w:r>
-          </w:p>
-        </w:tc>
-        <w:tc>
-          <w:tcPr>
-            <w:tcW w:type="dxa" w:w="1872"/>
-          </w:tcPr>
-          <w:p>
-            <w:pPr>
-              <w:spacing w:before="20" w:after="20"/>
-            </w:pPr>
-            <w:r>
-              <w:rPr>
-                <w:sz w:val="18"/>
-              </w:rPr>
-              <w:t>closure-readiness.ts</w:t>
-            </w:r>
-          </w:p>
-        </w:tc>
-        <w:tc>
-          <w:tcPr>
-            <w:tcW w:type="dxa" w:w="1872"/>
-          </w:tcPr>
-          <w:p>
-            <w:pPr>
-              <w:spacing w:before="20" w:after="20"/>
-            </w:pPr>
-            <w:r>
-              <w:rPr>
-                <w:sz w:val="18"/>
-              </w:rPr>
-              <w:t>CM41</w:t>
-            </w:r>
-          </w:p>
-        </w:tc>
-        <w:tc>
-          <w:tcPr>
-            <w:tcW w:type="dxa" w:w="1872"/>
-          </w:tcPr>
-          <w:p>
-            <w:pPr>
-              <w:spacing w:before="20" w:after="20"/>
-            </w:pPr>
-            <w:r>
-              <w:rPr>
-                <w:sz w:val="18"/>
-              </w:rPr>
-              <w:t>Checklist-based scoring to determine if a case meets all closure requirements</w:t>
-            </w:r>
-          </w:p>
-        </w:tc>
-      </w:tr>
-      <w:tr>
-        <w:tc>
-          <w:tcPr>
-            <w:tcW w:type="dxa" w:w="1872"/>
-          </w:tcPr>
-          <w:p>
-            <w:pPr>
-              <w:spacing w:before="20" w:after="20"/>
-            </w:pPr>
-            <w:r>
-              <w:rPr>
-                <w:sz w:val="18"/>
-              </w:rPr>
-              <w:t>15</w:t>
-            </w:r>
-          </w:p>
-        </w:tc>
-        <w:tc>
-          <w:tcPr>
-            <w:tcW w:type="dxa" w:w="1872"/>
-          </w:tcPr>
-          <w:p>
-            <w:pPr>
-              <w:spacing w:before="20" w:after="20"/>
-            </w:pPr>
-            <w:r>
-              <w:rPr>
-                <w:sz w:val="18"/>
-              </w:rPr>
-              <w:t>Financial Patterns</w:t>
-            </w:r>
-          </w:p>
-        </w:tc>
-        <w:tc>
-          <w:tcPr>
-            <w:tcW w:type="dxa" w:w="1872"/>
-          </w:tcPr>
-          <w:p>
-            <w:pPr>
-              <w:spacing w:before="20" w:after="20"/>
-            </w:pPr>
-            <w:r>
-              <w:rPr>
-                <w:sz w:val="18"/>
-              </w:rPr>
-              <w:t>financial-patterns.ts</w:t>
-            </w:r>
-          </w:p>
-        </w:tc>
-        <w:tc>
-          <w:tcPr>
-            <w:tcW w:type="dxa" w:w="1872"/>
-          </w:tcPr>
-          <w:p>
-            <w:pPr>
-              <w:spacing w:before="20" w:after="20"/>
-            </w:pPr>
-            <w:r>
-              <w:rPr>
-                <w:sz w:val="18"/>
-              </w:rPr>
-              <w:t>FC1, RRS24</w:t>
-            </w:r>
-          </w:p>
-        </w:tc>
-        <w:tc>
-          <w:tcPr>
-            <w:tcW w:type="dxa" w:w="1872"/>
-          </w:tcPr>
-          <w:p>
-            <w:pPr>
-              <w:spacing w:before="20" w:after="20"/>
-            </w:pPr>
-            <w:r>
-              <w:rPr>
-                <w:sz w:val="18"/>
-              </w:rPr>
-              <w:t>Pattern mining across financial results to detect round-number clustering, duplicates, and suspicious distributions</w:t>
-            </w:r>
-          </w:p>
-        </w:tc>
-      </w:tr>
-      <w:tr>
-        <w:tc>
-          <w:tcPr>
-            <w:tcW w:type="dxa" w:w="1872"/>
-          </w:tcPr>
-          <w:p>
-            <w:pPr>
-              <w:spacing w:before="20" w:after="20"/>
-            </w:pPr>
-            <w:r>
-              <w:rPr>
-                <w:sz w:val="18"/>
-              </w:rPr>
-              <w:t>16</w:t>
-            </w:r>
-          </w:p>
-        </w:tc>
-        <w:tc>
-          <w:tcPr>
-            <w:tcW w:type="dxa" w:w="1872"/>
-          </w:tcPr>
-          <w:p>
-            <w:pPr>
-              <w:spacing w:before="20" w:after="20"/>
-            </w:pPr>
-            <w:r>
-              <w:rPr>
-                <w:sz w:val="18"/>
-              </w:rPr>
-              <w:t>Subject Risk Profiling</w:t>
-            </w:r>
-          </w:p>
-        </w:tc>
-        <w:tc>
-          <w:tcPr>
-            <w:tcW w:type="dxa" w:w="1872"/>
-          </w:tcPr>
-          <w:p>
-            <w:pPr>
-              <w:spacing w:before="20" w:after="20"/>
-            </w:pPr>
-            <w:r>
-              <w:rPr>
-                <w:sz w:val="18"/>
-              </w:rPr>
-              <w:t>subject-risk.ts</w:t>
-            </w:r>
-          </w:p>
-        </w:tc>
-        <w:tc>
-          <w:tcPr>
-            <w:tcW w:type="dxa" w:w="1872"/>
-          </w:tcPr>
-          <w:p>
-            <w:pPr>
-              <w:spacing w:before="20" w:after="20"/>
-            </w:pPr>
-            <w:r>
-              <w:rPr>
-                <w:sz w:val="18"/>
-              </w:rPr>
-              <w:t>CM8, CM49</w:t>
-            </w:r>
-          </w:p>
-        </w:tc>
-        <w:tc>
-          <w:tcPr>
-            <w:tcW w:type="dxa" w:w="1872"/>
-          </w:tcPr>
-          <w:p>
-            <w:pPr>
-              <w:spacing w:before="20" w:after="20"/>
-            </w:pPr>
-            <w:r>
-              <w:rPr>
-                <w:sz w:val="18"/>
-              </w:rPr>
-              <w:t>Multi-factor risk scoring for subjects based on case history, violation count, and recidivism patterns</w:t>
-            </w:r>
-          </w:p>
-        </w:tc>
-      </w:tr>
-      <w:tr>
-        <w:tc>
-          <w:tcPr>
-            <w:tcW w:type="dxa" w:w="1872"/>
-          </w:tcPr>
-          <w:p>
-            <w:pPr>
-              <w:spacing w:before="20" w:after="20"/>
-            </w:pPr>
-            <w:r>
-              <w:rPr>
-                <w:sz w:val="18"/>
-              </w:rPr>
-              <w:t>17</w:t>
-            </w:r>
-          </w:p>
-        </w:tc>
-        <w:tc>
-          <w:tcPr>
-            <w:tcW w:type="dxa" w:w="1872"/>
-          </w:tcPr>
-          <w:p>
-            <w:pPr>
-              <w:spacing w:before="20" w:after="20"/>
-            </w:pPr>
-            <w:r>
-              <w:rPr>
-                <w:sz w:val="18"/>
-              </w:rPr>
-              <w:t>Case Narrative</w:t>
-            </w:r>
-          </w:p>
-        </w:tc>
-        <w:tc>
-          <w:tcPr>
-            <w:tcW w:type="dxa" w:w="1872"/>
-          </w:tcPr>
-          <w:p>
-            <w:pPr>
-              <w:spacing w:before="20" w:after="20"/>
-            </w:pPr>
-            <w:r>
-              <w:rPr>
-                <w:sz w:val="18"/>
-              </w:rPr>
-              <w:t>case-narrative.ts</w:t>
-            </w:r>
-          </w:p>
-        </w:tc>
-        <w:tc>
-          <w:tcPr>
-            <w:tcW w:type="dxa" w:w="1872"/>
-          </w:tcPr>
-          <w:p>
-            <w:pPr>
-              <w:spacing w:before="20" w:after="20"/>
-            </w:pPr>
-            <w:r>
-              <w:rPr>
-                <w:sz w:val="18"/>
-              </w:rPr>
-              <w:t>RRS16, CM34</w:t>
-            </w:r>
-          </w:p>
-        </w:tc>
-        <w:tc>
-          <w:tcPr>
-            <w:tcW w:type="dxa" w:w="1872"/>
-          </w:tcPr>
-          <w:p>
-            <w:pPr>
-              <w:spacing w:before="20" w:after="20"/>
-            </w:pPr>
-            <w:r>
-              <w:rPr>
-                <w:sz w:val="18"/>
-              </w:rPr>
-              <w:t>Automated generation of structured case narratives with sections for opening, subjects, investigation, violations, financials, referrals, and status</w:t>
-            </w:r>
-          </w:p>
-        </w:tc>
-      </w:tr>
-      <w:tr>
-        <w:tc>
-          <w:tcPr>
-            <w:tcW w:type="dxa" w:w="1872"/>
-          </w:tcPr>
-          <w:p>
-            <w:pPr>
-              <w:spacing w:before="20" w:after="20"/>
-            </w:pPr>
-            <w:r>
-              <w:rPr>
-                <w:sz w:val="18"/>
-              </w:rPr>
-              <w:t>18</w:t>
-            </w:r>
-          </w:p>
-        </w:tc>
-        <w:tc>
-          <w:tcPr>
-            <w:tcW w:type="dxa" w:w="1872"/>
-          </w:tcPr>
-          <w:p>
-            <w:pPr>
-              <w:spacing w:before="20" w:after="20"/>
-            </w:pPr>
-            <w:r>
-              <w:rPr>
-                <w:sz w:val="18"/>
-              </w:rPr>
-              <w:t>Case Clustering</w:t>
-            </w:r>
-          </w:p>
-        </w:tc>
-        <w:tc>
-          <w:tcPr>
-            <w:tcW w:type="dxa" w:w="1872"/>
-          </w:tcPr>
-          <w:p>
-            <w:pPr>
-              <w:spacing w:before="20" w:after="20"/>
-            </w:pPr>
-            <w:r>
-              <w:rPr>
-                <w:sz w:val="18"/>
-              </w:rPr>
-              <w:t>(via case-similarity.ts)</w:t>
-            </w:r>
-          </w:p>
-        </w:tc>
-        <w:tc>
-          <w:tcPr>
-            <w:tcW w:type="dxa" w:w="1872"/>
-          </w:tcPr>
-          <w:p>
-            <w:pPr>
-              <w:spacing w:before="20" w:after="20"/>
-            </w:pPr>
-            <w:r>
-              <w:rPr>
-                <w:sz w:val="18"/>
-              </w:rPr>
-              <w:t>RRS11</w:t>
-            </w:r>
-          </w:p>
-        </w:tc>
-        <w:tc>
-          <w:tcPr>
-            <w:tcW w:type="dxa" w:w="1872"/>
-          </w:tcPr>
-          <w:p>
-            <w:pPr>
-              <w:spacing w:before="20" w:after="20"/>
-            </w:pPr>
-            <w:r>
-              <w:rPr>
-                <w:sz w:val="18"/>
-              </w:rPr>
-              <w:t>Groups similar cases into clusters based on attribute similarity vectors</w:t>
-            </w:r>
-          </w:p>
-        </w:tc>
-      </w:tr>
-    </w:tbl>
-    <w:p/>
     <w:p>
       <w:pPr>
+        <w:spacing w:after="80"/>
+      </w:pPr>
+      <w:r>
+        <w:t>SOW: RRS3, RRS22, CM32 | Endpoint: GET /api/ai/anomalies | Cache: 10 min</w:t>
+      </w:r>
+    </w:p>
+    <w:p>
+      <w:pPr>
+        <w:spacing w:after="80"/>
+      </w:pPr>
+      <w:r>
+        <w:t>Three detection functions using z-score statistical analysis:</w:t>
+      </w:r>
+    </w:p>
+    <w:p>
+      <w:pPr>
+        <w:pStyle w:val="ListBullet"/>
+        <w:spacing w:before="20" w:after="20"/>
+      </w:pPr>
+      <w:r>
+        <w:t>Financial Anomalies: Groups all FinancialResult records by type (RECOVERY, FINE, RESTITUTION, SAVINGS), calculates mean and standard deviation per type, flags any result where amount &gt; mean + 2σ. Returns anomalies with z-scores and severity (CRITICAL if z &gt; 3, HIGH if z &gt; 2).</w:t>
+      </w:r>
+    </w:p>
+    <w:p>
+      <w:pPr>
+        <w:pStyle w:val="ListBullet"/>
+        <w:spacing w:before="20" w:after="20"/>
+      </w:pPr>
+      <w:r>
+        <w:t>Case Anomalies: Flags cases with: duration exceeding mean + 2σ days open, document count &gt; mean + 2σ, evidence count &gt; mean + 2σ, or financial totals significantly above average.</w:t>
+      </w:r>
+    </w:p>
+    <w:p>
+      <w:pPr>
+        <w:pStyle w:val="ListBullet"/>
+        <w:spacing w:before="20" w:after="20"/>
+      </w:pPr>
+      <w:r>
+        <w:t>Activity Anomalies: Analyzes last 30 days of AuditLog entries per user. Flags users with significantly more or fewer entries than average, and users with excessive ACCESS_DENIED events.</w:t>
+      </w:r>
+    </w:p>
+    <w:p>
+      <w:pPr>
         <w:pStyle w:val="Heading2"/>
       </w:pPr>
       <w:r>
-        <w:t>Claude LLM-Powered Endpoints</w:t>
+        <w:t>6.2 Risk Scoring (`src/lib/ai/risk-scoring.ts`)</w:t>
+      </w:r>
+    </w:p>
+    <w:p>
+      <w:pPr>
+        <w:spacing w:after="80"/>
+      </w:pPr>
+      <w:r>
+        <w:t>SOW: HWC1, CM1, C17 | Endpoint: POST /api/ai/risk-score</w:t>
+      </w:r>
+    </w:p>
+    <w:p>
+      <w:pPr>
+        <w:spacing w:after="80"/>
+      </w:pPr>
+      <w:r>
+        <w:t>Keyword-weighted scoring system producing a score 0–100 with risk level classification:</w:t>
+      </w:r>
+    </w:p>
+    <w:p>
+      <w:pPr>
+        <w:pStyle w:val="ListBullet"/>
+        <w:spacing w:before="20" w:after="20"/>
+      </w:pPr>
+      <w:r>
+        <w:t>Keyword Analysis (+5 to +20): Scans description for high-risk terms: "fraud" (+20), "theft" (+15), "bribery" (+15), "retaliation" (+15), "billing" (+10), "kickback" (+10), "safety" (+10), etc.</w:t>
+      </w:r>
+    </w:p>
+    <w:p>
+      <w:pPr>
+        <w:pStyle w:val="ListBullet"/>
+        <w:spacing w:before="20" w:after="20"/>
+      </w:pPr>
+      <w:r>
+        <w:t>Source Weight (+5 to +15): WHISTLEBLOWER=+15, CONGRESSIONAL=+10, HOTLINE=+5.</w:t>
+      </w:r>
+    </w:p>
+    <w:p>
+      <w:pPr>
+        <w:pStyle w:val="ListBullet"/>
+        <w:spacing w:before="20" w:after="20"/>
+      </w:pPr>
+      <w:r>
+        <w:t>Contact Information (+5 to +10): Non-anonymous=+10, has email=+5, has phone=+5.</w:t>
+      </w:r>
+    </w:p>
+    <w:p>
+      <w:pPr>
+        <w:pStyle w:val="ListBullet"/>
+        <w:spacing w:before="20" w:after="20"/>
+      </w:pPr>
+      <w:r>
+        <w:t>Description Quality (+5 to +15): Longer, more detailed descriptions score higher.</w:t>
+      </w:r>
+    </w:p>
+    <w:p>
+      <w:pPr>
+        <w:pStyle w:val="ListBullet"/>
+        <w:spacing w:before="20" w:after="20"/>
+      </w:pPr>
+      <w:r>
+        <w:t>Category Match (+10): High-priority categories (FRAUD, MISCONDUCT) receive bonus.</w:t>
+      </w:r>
+    </w:p>
+    <w:p>
+      <w:pPr>
+        <w:pStyle w:val="ListBullet"/>
+        <w:spacing w:before="20" w:after="20"/>
+      </w:pPr>
+      <w:r>
+        <w:t>Output: { score: 0-100, riskLevel: LOW|MEDIUM|HIGH|CRITICAL, factors: [{factor, points, description}] }</w:t>
+      </w:r>
+    </w:p>
+    <w:p>
+      <w:pPr>
+        <w:pStyle w:val="ListBullet"/>
+        <w:spacing w:before="20" w:after="20"/>
+      </w:pPr>
+      <w:r>
+        <w:t>Integration: Auto-runs on every hotline and whistleblower submission. Scores &gt;75 auto-escalate priority to HIGH or CRITICAL. Risk score stored on PreliminaryInquiry.riskScore.</w:t>
+      </w:r>
+    </w:p>
+    <w:p>
+      <w:pPr>
+        <w:pStyle w:val="Heading2"/>
+      </w:pPr>
+      <w:r>
+        <w:t>6.3 Predictive Analytics (`src/lib/ai/predictions.ts`)</w:t>
+      </w:r>
+    </w:p>
+    <w:p>
+      <w:pPr>
+        <w:spacing w:after="80"/>
+      </w:pPr>
+      <w:r>
+        <w:t>SOW: RRS3, RRS12, RRS22 | Endpoint: GET /api/ai/predictions</w:t>
+      </w:r>
+    </w:p>
+    <w:p>
+      <w:pPr>
+        <w:spacing w:after="80"/>
+      </w:pPr>
+      <w:r>
+        <w:t>Four prediction functions using linear regression on historical case data:</w:t>
+      </w:r>
+    </w:p>
+    <w:p>
+      <w:pPr>
+        <w:pStyle w:val="ListBullet"/>
+        <w:spacing w:before="20" w:after="20"/>
+      </w:pPr>
+      <w:r>
+        <w:t>predictCaseDuration(caseData): Predicts days to close based on composite feature scoring of case type, priority, and subject count. Uses historical closed cases to build regression model. Output: predicted days with confidence.</w:t>
+      </w:r>
+    </w:p>
+    <w:p>
+      <w:pPr>
+        <w:pStyle w:val="ListBullet"/>
+        <w:spacing w:before="20" w:after="20"/>
+      </w:pPr>
+      <w:r>
+        <w:t>predictClosureOutcome(caseData): Predicts SUBSTANTIATED vs UNSUBSTANTIATED using nearest-centroid classification with Bayesian prior blending. Input features: case type, evidence count, violation count, financial results.</w:t>
+      </w:r>
+    </w:p>
+    <w:p>
+      <w:pPr>
+        <w:pStyle w:val="ListBullet"/>
+        <w:spacing w:before="20" w:after="20"/>
+      </w:pPr>
+      <w:r>
+        <w:t>predictCaseload(): Forecasts next month's new cases using linear regression on 12-month trend of openedAt dates.</w:t>
+      </w:r>
+    </w:p>
+    <w:p>
+      <w:pPr>
+        <w:pStyle w:val="ListBullet"/>
+        <w:spacing w:before="20" w:after="20"/>
+      </w:pPr>
+      <w:r>
+        <w:t>identifyAtRiskCases(): Flags active cases likely to miss due dates by comparing current progress (tasks completed / total, days remaining) against predicted duration.</w:t>
+      </w:r>
+    </w:p>
+    <w:p>
+      <w:pPr>
+        <w:pStyle w:val="Heading2"/>
+      </w:pPr>
+      <w:r>
+        <w:t>6.4 Case Similarity &amp; Clustering (`src/lib/ai/case-similarity.ts`)</w:t>
+      </w:r>
+    </w:p>
+    <w:p>
+      <w:pPr>
+        <w:spacing w:after="80"/>
+      </w:pPr>
+      <w:r>
+        <w:t>SOW: CM4, RRS11 | Endpoints: GET /api/ai/similar-cases?caseId=, GET /api/ai/clusters</w:t>
+      </w:r>
+    </w:p>
+    <w:p>
+      <w:pPr>
+        <w:pStyle w:val="ListBullet"/>
+        <w:spacing w:before="20" w:after="20"/>
+      </w:pPr>
+      <w:r>
+        <w:t>Similarity: Constructs 22-dimensional feature vectors per case: case type (one-hot encoded, 9 dims), priority (ordinal, 1 dim), complaint source (one-hot, 8 dims), plus numeric features (subject count, evidence count, financial total, violation count). Computes cosine similarity between the target case and all other cases. Returns top N most similar with similarity score (0.0–1.0) and shared features.</w:t>
+      </w:r>
+    </w:p>
+    <w:p>
+      <w:pPr>
+        <w:pStyle w:val="ListBullet"/>
+        <w:spacing w:before="20" w:after="20"/>
+      </w:pPr>
+      <w:r>
+        <w:t>Clustering: Implements k-means clustering (k=5) with Euclidean distance on the same feature vectors. Each cluster is labeled with its most common case type and complaint source. Iterates until convergence or 100 iterations.</w:t>
+      </w:r>
+    </w:p>
+    <w:p>
+      <w:pPr>
+        <w:pStyle w:val="Heading2"/>
+      </w:pPr>
+      <w:r>
+        <w:t>6.5 Duplicate Entity Resolution (`src/lib/ai/entity-resolution.ts`)</w:t>
+      </w:r>
+    </w:p>
+    <w:p>
+      <w:pPr>
+        <w:spacing w:after="80"/>
+      </w:pPr>
+      <w:r>
+        <w:t>SOW: EF15, WPN16 | Endpoint: GET /api/ai/duplicate-subjects</w:t>
+      </w:r>
+    </w:p>
+    <w:p>
+      <w:pPr>
+        <w:spacing w:after="80"/>
+      </w:pPr>
+      <w:r>
+        <w:t>Multi-method fuzzy matching to detect duplicate subjects across the entire database:</w:t>
+      </w:r>
+    </w:p>
+    <w:p>
+      <w:pPr>
+        <w:pStyle w:val="ListBullet"/>
+        <w:spacing w:before="20" w:after="20"/>
+      </w:pPr>
+      <w:r>
+        <w:t>Levenshtein Distance: Edit distance algorithm implemented from scratch. Names with distance &lt; 3 edits are flagged as potential matches.</w:t>
+      </w:r>
+    </w:p>
+    <w:p>
+      <w:pPr>
+        <w:pStyle w:val="ListBullet"/>
+        <w:spacing w:before="20" w:after="20"/>
+      </w:pPr>
+      <w:r>
+        <w:t>Soundex Phonetic Matching: Classic Soundex algorithm implemented from scratch (letter → code mapping: B/F/P/V→1, C/G/J/K/Q/S/X/Z→2, D/T→3, L→4, M/N→5, R→6). Subjects with matching Soundex codes are flagged regardless of spelling.</w:t>
+      </w:r>
+    </w:p>
+    <w:p>
+      <w:pPr>
+        <w:pStyle w:val="ListBullet"/>
+        <w:spacing w:before="20" w:after="20"/>
+      </w:pPr>
+      <w:r>
+        <w:t>Email Domain Matching: Subjects sharing the same email domain are flagged.</w:t>
+      </w:r>
+    </w:p>
+    <w:p>
+      <w:pPr>
+        <w:pStyle w:val="ListBullet"/>
+        <w:spacing w:before="20" w:after="20"/>
+      </w:pPr>
+      <w:r>
+        <w:t>Address Similarity: Partial string matching on address fields.</w:t>
+      </w:r>
+    </w:p>
+    <w:p>
+      <w:pPr>
+        <w:pStyle w:val="ListBullet"/>
+        <w:spacing w:before="20" w:after="20"/>
+      </w:pPr>
+      <w:r>
+        <w:t>Confidence Score: Combined weighted score 0.0–1.0 from all matching methods. Pairs with confidence &gt; 0.3 are returned.</w:t>
+      </w:r>
+    </w:p>
+    <w:p>
+      <w:pPr>
+        <w:pStyle w:val="Heading2"/>
+      </w:pPr>
+      <w:r>
+        <w:t>6.6 Network Analysis (`src/lib/ai/network-analysis.ts`)</w:t>
+      </w:r>
+    </w:p>
+    <w:p>
+      <w:pPr>
+        <w:spacing w:after="80"/>
+      </w:pPr>
+      <w:r>
+        <w:t>SOW: CM49, CM4, WPN16 | Endpoint: GET /api/ai/network | Cache: 10 min</w:t>
+      </w:r>
+    </w:p>
+    <w:p>
+      <w:pPr>
+        <w:spacing w:after="80"/>
+      </w:pPr>
+      <w:r>
+        <w:t>Graph-based analysis of investigation relationships:</w:t>
+      </w:r>
+    </w:p>
+    <w:p>
+      <w:pPr>
+        <w:pStyle w:val="ListBullet"/>
+        <w:spacing w:before="20" w:after="20"/>
+      </w:pPr>
+      <w:r>
+        <w:t>Graph Construction: Builds an undirected graph where nodes = subjects + cases, edges = subject-case links (via CaseSubject) + case-case relationships (via CaseRelationship) + implicit shared-subject links between cases.</w:t>
+      </w:r>
+    </w:p>
+    <w:p>
+      <w:pPr>
+        <w:pStyle w:val="ListBullet"/>
+        <w:spacing w:before="20" w:after="20"/>
+      </w:pPr>
+      <w:r>
+        <w:t>Node Degree: Calculates connection count per node. High-degree nodes are "hubs" — subjects or cases central to multiple investigations.</w:t>
+      </w:r>
+    </w:p>
+    <w:p>
+      <w:pPr>
+        <w:pStyle w:val="ListBullet"/>
+        <w:spacing w:before="20" w:after="20"/>
+      </w:pPr>
+      <w:r>
+        <w:t>Connected Components: BFS traversal identifies isolated clusters of related entities. Each component represents a distinct group of linked investigations.</w:t>
+      </w:r>
+    </w:p>
+    <w:p>
+      <w:pPr>
+        <w:pStyle w:val="ListBullet"/>
+        <w:spacing w:before="20" w:after="20"/>
+      </w:pPr>
+      <w:r>
+        <w:t>Fraud Ring Detection: Identifies subjects appearing in 2 or more cases together. Groups of co-occurring subjects across multiple cases are flagged as potential organized fraud rings. Returns ring members and linked case IDs.</w:t>
+      </w:r>
+    </w:p>
+    <w:p>
+      <w:pPr>
+        <w:pStyle w:val="Heading2"/>
+      </w:pPr>
+      <w:r>
+        <w:t>6.7 Document Classification (`src/lib/ai/document-classifier.ts`)</w:t>
+      </w:r>
+    </w:p>
+    <w:p>
+      <w:pPr>
+        <w:spacing w:after="80"/>
+      </w:pPr>
+      <w:r>
+        <w:t>SOW: DMR1, EF5, EF7 | Endpoint: POST /api/ai/classify-document</w:t>
+      </w:r>
+    </w:p>
+    <w:p>
+      <w:pPr>
+        <w:spacing w:after="80"/>
+      </w:pPr>
+      <w:r>
+        <w:t>Rule-based document classification into 8 categories with auto-tagging:</w:t>
+      </w:r>
+    </w:p>
+    <w:p>
+      <w:pPr>
+        <w:pStyle w:val="ListBullet"/>
+        <w:spacing w:before="20" w:after="20"/>
+      </w:pPr>
+      <w:r>
+        <w:t>Classification Rules (regex on title/filename): "subpoena"→LEGAL_SUBPOENA (0.9), "interview"/"MOI"/"memorandum"→INTERVIEW_MEMO (0.85), "report"/"ROI"→INVESTIGATION_REPORT (0.8), "invoice"/"receipt"/"billing"→FINANCIAL_RECORD (0.85), "photo"/"image"/"screenshot"→PHOTOGRAPHIC_EVIDENCE (0.9), "email"/"correspondence"→CORRESPONDENCE (0.75), "contract"/"agreement"→CONTRACT (0.8), "warrant"/"affidavit"→COURT_DOCUMENT (0.85), default→GENERAL_DOCUMENT (0.5).</w:t>
+      </w:r>
+    </w:p>
+    <w:p>
+      <w:pPr>
+        <w:pStyle w:val="ListBullet"/>
+        <w:spacing w:before="20" w:after="20"/>
+      </w:pPr>
+      <w:r>
+        <w:t>MIME Type Boost: Image MIMEs boost PHOTOGRAPHIC_EVIDENCE confidence. Audio/video boost TESTIMONY.</w:t>
+      </w:r>
+    </w:p>
+    <w:p>
+      <w:pPr>
+        <w:pStyle w:val="ListBullet"/>
+        <w:spacing w:before="20" w:after="20"/>
+      </w:pPr>
+      <w:r>
+        <w:t>Auto-Tagging: Extracts dollar amounts ($X,XXX), dates, case numbers (OIG-XXXX-XXX), agency names (FBI, DOJ, SEC, etc.), and PII indicators.</w:t>
+      </w:r>
+    </w:p>
+    <w:p>
+      <w:pPr>
+        <w:pStyle w:val="ListBullet"/>
+        <w:spacing w:before="20" w:after="20"/>
+      </w:pPr>
+      <w:r>
+        <w:t>Integration: Runs automatically on every document upload. Results stored in Document.aiCategory and Document.aiTags.</w:t>
+      </w:r>
+    </w:p>
+    <w:p>
+      <w:pPr>
+        <w:pStyle w:val="Heading2"/>
+      </w:pPr>
+      <w:r>
+        <w:t>6.8 Investigator Recommendation Engine (`src/lib/ai/investigator-recommender.ts`)</w:t>
+      </w:r>
+    </w:p>
+    <w:p>
+      <w:pPr>
+        <w:spacing w:after="80"/>
+      </w:pPr>
+      <w:r>
+        <w:t>SOW: CM3, WPN19 | Endpoint: POST /api/ai/recommend-investigator</w:t>
+      </w:r>
+    </w:p>
+    <w:p>
+      <w:pPr>
+        <w:spacing w:after="80"/>
+      </w:pPr>
+      <w:r>
+        <w:t>Multi-factor scoring to recommend the best investigator for a new case:</w:t>
+      </w:r>
+    </w:p>
+    <w:p>
+      <w:pPr>
+        <w:pStyle w:val="ListBullet"/>
+        <w:spacing w:before="20" w:after="20"/>
+      </w:pPr>
+      <w:r>
+        <w:t>Expertise Match (30 pts): Ratio of past cases with the same caseType to total assigned cases. An investigator who has handled 10 fraud cases out of 15 total scores 20/30 for a new fraud case.</w:t>
+      </w:r>
+    </w:p>
+    <w:p>
+      <w:pPr>
+        <w:pStyle w:val="ListBullet"/>
+        <w:spacing w:before="20" w:after="20"/>
+      </w:pPr>
+      <w:r>
+        <w:t>Current Workload (25 pts): Inverse of active case count. Fewer active cases = higher score.</w:t>
+      </w:r>
+    </w:p>
+    <w:p>
+      <w:pPr>
+        <w:pStyle w:val="ListBullet"/>
+        <w:spacing w:before="20" w:after="20"/>
+      </w:pPr>
+      <w:r>
+        <w:t>Success Rate (25 pts): Ratio of closed cases to total assigned cases.</w:t>
+      </w:r>
+    </w:p>
+    <w:p>
+      <w:pPr>
+        <w:pStyle w:val="ListBullet"/>
+        <w:spacing w:before="20" w:after="20"/>
+      </w:pPr>
+      <w:r>
+        <w:t>Availability (20 pts): Bonus if no cases have due dates this week.</w:t>
+      </w:r>
+    </w:p>
+    <w:p>
+      <w:pPr>
+        <w:pStyle w:val="ListBullet"/>
+        <w:spacing w:before="20" w:after="20"/>
+      </w:pPr>
+      <w:r>
+        <w:t>Returns top 3 investigators with total score and individual factor breakdowns.</w:t>
+      </w:r>
+    </w:p>
+    <w:p>
+      <w:pPr>
+        <w:pStyle w:val="Heading2"/>
+      </w:pPr>
+      <w:r>
+        <w:t>6.9 Auto-Escalation Engine (`src/lib/ai/auto-escalation.ts`)</w:t>
+      </w:r>
+    </w:p>
+    <w:p>
+      <w:pPr>
+        <w:spacing w:after="80"/>
+      </w:pPr>
+      <w:r>
+        <w:t>SOW: CM35, WPN13 | Endpoint: GET /api/ai/escalations | Cache: 5 min</w:t>
+      </w:r>
+    </w:p>
+    <w:p>
+      <w:pPr>
+        <w:spacing w:after="80"/>
+      </w:pPr>
+      <w:r>
+        <w:t>Scans all ACTIVE/OPEN cases and recommends priority escalations:</w:t>
+      </w:r>
+    </w:p>
+    <w:p>
+      <w:pPr>
+        <w:pStyle w:val="ListBullet"/>
+        <w:spacing w:before="20" w:after="20"/>
+      </w:pPr>
+      <w:r>
+        <w:t>Financial Threshold: Cases with total financial results &gt; $500K and priority != CRITICAL → recommend CRITICAL.</w:t>
+      </w:r>
+    </w:p>
+    <w:p>
+      <w:pPr>
+        <w:pStyle w:val="ListBullet"/>
+        <w:spacing w:before="20" w:after="20"/>
+      </w:pPr>
+      <w:r>
+        <w:t>Deadline Proximity: Cases with due date within 7 days and priority LOW/MEDIUM → recommend HIGH.</w:t>
+      </w:r>
+    </w:p>
+    <w:p>
+      <w:pPr>
+        <w:pStyle w:val="ListBullet"/>
+        <w:spacing w:before="20" w:after="20"/>
+      </w:pPr>
+      <w:r>
+        <w:t>Stale Cases: Cases with no AuditLog entries in 14 days → flag as stale requiring attention.</w:t>
+      </w:r>
+    </w:p>
+    <w:p>
+      <w:pPr>
+        <w:pStyle w:val="ListBullet"/>
+        <w:spacing w:before="20" w:after="20"/>
+      </w:pPr>
+      <w:r>
+        <w:t>Evidence Gap: Cases with &gt;10 evidence items but 0 violations recorded → flag for review.</w:t>
+      </w:r>
+    </w:p>
+    <w:p>
+      <w:pPr>
+        <w:pStyle w:val="Heading2"/>
+      </w:pPr>
+      <w:r>
+        <w:t>6.10 Evidence Strength Scoring (`src/lib/ai/evidence-strength.ts`)</w:t>
+      </w:r>
+    </w:p>
+    <w:p>
+      <w:pPr>
+        <w:spacing w:after="80"/>
+      </w:pPr>
+      <w:r>
+        <w:t>SOW: WPN23, AF6 | Endpoint: GET /api/ai/evidence-strength?caseId=</w:t>
+      </w:r>
+    </w:p>
+    <w:p>
+      <w:pPr>
+        <w:spacing w:after="80"/>
+      </w:pPr>
+      <w:r>
+        <w:t>Point-based scoring system producing a 0–100 score with letter grade:</w:t>
+      </w:r>
+    </w:p>
+    <w:p>
+      <w:pPr>
+        <w:pStyle w:val="ListBullet"/>
+        <w:spacing w:before="20" w:after="20"/>
+      </w:pPr>
+      <w:r>
+        <w:t>Per-Item Points: DOCUMENT=+3, PHOTO=+3, DIGITAL=+4, TESTIMONY=+2, PHYSICAL=+5, VIDEO=+4, AUDIO=+3 per item (capped at 40).</w:t>
+      </w:r>
+    </w:p>
+    <w:p>
+      <w:pPr>
+        <w:pStyle w:val="ListBullet"/>
+        <w:spacing w:before="20" w:after="20"/>
+      </w:pPr>
+      <w:r>
+        <w:t>Custody Chain Completeness (+10): All evidence items have ≥2 chain-of-custody entries.</w:t>
+      </w:r>
+    </w:p>
+    <w:p>
+      <w:pPr>
+        <w:pStyle w:val="ListBullet"/>
+        <w:spacing w:before="20" w:after="20"/>
+      </w:pPr>
+      <w:r>
+        <w:t>Type Diversity (+15): Evidence from 3+ different types.</w:t>
+      </w:r>
+    </w:p>
+    <w:p>
+      <w:pPr>
+        <w:pStyle w:val="ListBullet"/>
+        <w:spacing w:before="20" w:after="20"/>
+      </w:pPr>
+      <w:r>
+        <w:t>Source Corroboration (+10): Evidence from different sources.</w:t>
+      </w:r>
+    </w:p>
+    <w:p>
+      <w:pPr>
+        <w:pStyle w:val="ListBullet"/>
+        <w:spacing w:before="20" w:after="20"/>
+      </w:pPr>
+      <w:r>
+        <w:t>Timeline Coverage (+5): Evidence dates span &gt;30 days.</w:t>
+      </w:r>
+    </w:p>
+    <w:p>
+      <w:pPr>
+        <w:pStyle w:val="ListBullet"/>
+        <w:spacing w:before="20" w:after="20"/>
+      </w:pPr>
+      <w:r>
+        <w:t>Grading: A=80+, B=65+, C=50+, D=35+, F=&lt;35.</w:t>
+      </w:r>
+    </w:p>
+    <w:p>
+      <w:pPr>
+        <w:pStyle w:val="Heading2"/>
+      </w:pPr>
+      <w:r>
+        <w:t>6.11 Timeline Anomaly Detection (`src/lib/ai/timeline-anomalies.ts`)</w:t>
+      </w:r>
+    </w:p>
+    <w:p>
+      <w:pPr>
+        <w:spacing w:after="80"/>
+      </w:pPr>
+      <w:r>
+        <w:t>SOW: CM14, AF4 | Endpoint: GET /api/ai/timeline-anomalies?caseId=</w:t>
+      </w:r>
+    </w:p>
+    <w:p>
+      <w:pPr>
+        <w:spacing w:after="80"/>
+      </w:pPr>
+      <w:r>
+        <w:t>Builds a unified timeline from status changes, notes, documents, evidence, and tasks, then flags:</w:t>
+      </w:r>
+    </w:p>
+    <w:p>
+      <w:pPr>
+        <w:pStyle w:val="ListBullet"/>
+        <w:spacing w:before="20" w:after="20"/>
+      </w:pPr>
+      <w:r>
+        <w:t>Activity Gaps: Periods &gt;30 days with no recorded activity (severity: MEDIUM if 30-60 days, HIGH if &gt;60).</w:t>
+      </w:r>
+    </w:p>
+    <w:p>
+      <w:pPr>
+        <w:pStyle w:val="ListBullet"/>
+        <w:spacing w:before="20" w:after="20"/>
+      </w:pPr>
+      <w:r>
+        <w:t>Post-Review Evidence: Evidence collected after case moved to UNDER_REVIEW or later status (severity: HIGH — may indicate procedural irregularity).</w:t>
+      </w:r>
+    </w:p>
+    <w:p>
+      <w:pPr>
+        <w:pStyle w:val="ListBullet"/>
+        <w:spacing w:before="20" w:after="20"/>
+      </w:pPr>
+      <w:r>
+        <w:t>Weekend/Holiday Uploads: Documents uploaded on Saturday or Sunday (severity: LOW — may be legitimate but flagged for awareness).</w:t>
+      </w:r>
+    </w:p>
+    <w:p>
+      <w:pPr>
+        <w:pStyle w:val="ListBullet"/>
+        <w:spacing w:before="20" w:after="20"/>
+      </w:pPr>
+      <w:r>
+        <w:t>Rapid Status Changes: Multiple status changes on the same day (severity: MEDIUM — may indicate testing or errors).</w:t>
+      </w:r>
+    </w:p>
+    <w:p>
+      <w:pPr>
+        <w:pStyle w:val="Heading2"/>
+      </w:pPr>
+      <w:r>
+        <w:t>6.12 Closure Readiness Scoring (`src/lib/ai/closure-readiness.ts`)</w:t>
+      </w:r>
+    </w:p>
+    <w:p>
+      <w:pPr>
+        <w:spacing w:after="80"/>
+      </w:pPr>
+      <w:r>
+        <w:t>SOW: CM40, CM41 | Endpoint: GET /api/ai/closure-readiness?caseId=</w:t>
+      </w:r>
+    </w:p>
+    <w:p>
+      <w:pPr>
+        <w:spacing w:after="80"/>
+      </w:pPr>
+      <w:r>
+        <w:t>13-criteria checklist scoring system (total 100 points):</w:t>
       </w:r>
     </w:p>
     <w:tbl>
@@ -9724,7 +8846,7 @@
               <w:rPr>
                 <w:sz w:val="18"/>
               </w:rPr>
-              <w:t>#</w:t>
+              <w:t>Criterion</w:t>
             </w:r>
           </w:p>
         </w:tc>
@@ -9740,7 +8862,7 @@
               <w:rPr>
                 <w:sz w:val="18"/>
               </w:rPr>
-              <w:t>Endpoint</w:t>
+              <w:t>Points</w:t>
             </w:r>
           </w:p>
         </w:tc>
@@ -9756,7 +8878,7 @@
               <w:rPr>
                 <w:sz w:val="18"/>
               </w:rPr>
-              <w:t>Purpose</w:t>
+              <w:t>Check</w:t>
             </w:r>
           </w:p>
         </w:tc>
@@ -9774,7 +8896,7 @@
               <w:rPr>
                 <w:sz w:val="18"/>
               </w:rPr>
-              <w:t>19</w:t>
+              <w:t>Subjects documented</w:t>
             </w:r>
           </w:p>
         </w:tc>
@@ -9790,7 +8912,7 @@
               <w:rPr>
                 <w:sz w:val="18"/>
               </w:rPr>
-              <w:t>/api/ai/natural-search</w:t>
+              <w:t>15</w:t>
             </w:r>
           </w:p>
         </w:tc>
@@ -9806,7 +8928,7 @@
               <w:rPr>
                 <w:sz w:val="18"/>
               </w:rPr>
-              <w:t>Natural language search -- converts plain English queries to structured search parameters</w:t>
+              <w:t>≥1 CaseSubject linked</w:t>
             </w:r>
           </w:p>
         </w:tc>
@@ -9824,7 +8946,7 @@
               <w:rPr>
                 <w:sz w:val="18"/>
               </w:rPr>
-              <w:t>20</w:t>
+              <w:t>Violations recorded</w:t>
             </w:r>
           </w:p>
         </w:tc>
@@ -9840,7 +8962,7 @@
               <w:rPr>
                 <w:sz w:val="18"/>
               </w:rPr>
-              <w:t>/api/ai/analyze-document</w:t>
+              <w:t>10</w:t>
             </w:r>
           </w:p>
         </w:tc>
@@ -9856,7 +8978,7 @@
               <w:rPr>
                 <w:sz w:val="18"/>
               </w:rPr>
-              <w:t>AI-powered document analysis and summarization</w:t>
+              <w:t>≥1 Violation</w:t>
             </w:r>
           </w:p>
         </w:tc>
@@ -9874,7 +8996,7 @@
               <w:rPr>
                 <w:sz w:val="18"/>
               </w:rPr>
-              <w:t>21</w:t>
+              <w:t>Evidence collected</w:t>
             </w:r>
           </w:p>
         </w:tc>
@@ -9890,7 +9012,7 @@
               <w:rPr>
                 <w:sz w:val="18"/>
               </w:rPr>
-              <w:t>/api/ai/interview-questions</w:t>
+              <w:t>10</w:t>
             </w:r>
           </w:p>
         </w:tc>
@@ -9906,7 +9028,7 @@
               <w:rPr>
                 <w:sz w:val="18"/>
               </w:rPr>
-              <w:t>Generates case-specific interview questions for investigation preparation</w:t>
+              <w:t>≥1 EvidenceItem</w:t>
             </w:r>
           </w:p>
         </w:tc>
@@ -9924,7 +9046,7 @@
               <w:rPr>
                 <w:sz w:val="18"/>
               </w:rPr>
-              <w:t>22</w:t>
+              <w:t>Evidence verified</w:t>
             </w:r>
           </w:p>
         </w:tc>
@@ -9940,7 +9062,7 @@
               <w:rPr>
                 <w:sz w:val="18"/>
               </w:rPr>
-              <w:t>/api/ai/generate-report</w:t>
+              <w:t>5</w:t>
             </w:r>
           </w:p>
         </w:tc>
@@ -9956,7 +9078,457 @@
               <w:rPr>
                 <w:sz w:val="18"/>
               </w:rPr>
-              <w:t>AI-assisted investigation report drafting</w:t>
+              <w:t>Any evidence with VERIFIED status</w:t>
+            </w:r>
+          </w:p>
+        </w:tc>
+      </w:tr>
+      <w:tr>
+        <w:tc>
+          <w:tcPr>
+            <w:tcW w:type="dxa" w:w="3120"/>
+          </w:tcPr>
+          <w:p>
+            <w:pPr>
+              <w:spacing w:before="20" w:after="20"/>
+            </w:pPr>
+            <w:r>
+              <w:rPr>
+                <w:sz w:val="18"/>
+              </w:rPr>
+              <w:t>Financial results</w:t>
+            </w:r>
+          </w:p>
+        </w:tc>
+        <w:tc>
+          <w:tcPr>
+            <w:tcW w:type="dxa" w:w="3120"/>
+          </w:tcPr>
+          <w:p>
+            <w:pPr>
+              <w:spacing w:before="20" w:after="20"/>
+            </w:pPr>
+            <w:r>
+              <w:rPr>
+                <w:sz w:val="18"/>
+              </w:rPr>
+              <w:t>10</w:t>
+            </w:r>
+          </w:p>
+        </w:tc>
+        <w:tc>
+          <w:tcPr>
+            <w:tcW w:type="dxa" w:w="3120"/>
+          </w:tcPr>
+          <w:p>
+            <w:pPr>
+              <w:spacing w:before="20" w:after="20"/>
+            </w:pPr>
+            <w:r>
+              <w:rPr>
+                <w:sz w:val="18"/>
+              </w:rPr>
+              <w:t>≥1 FinancialResult</w:t>
+            </w:r>
+          </w:p>
+        </w:tc>
+      </w:tr>
+      <w:tr>
+        <w:tc>
+          <w:tcPr>
+            <w:tcW w:type="dxa" w:w="3120"/>
+          </w:tcPr>
+          <w:p>
+            <w:pPr>
+              <w:spacing w:before="20" w:after="20"/>
+            </w:pPr>
+            <w:r>
+              <w:rPr>
+                <w:sz w:val="18"/>
+              </w:rPr>
+              <w:t>All tasks complete</w:t>
+            </w:r>
+          </w:p>
+        </w:tc>
+        <w:tc>
+          <w:tcPr>
+            <w:tcW w:type="dxa" w:w="3120"/>
+          </w:tcPr>
+          <w:p>
+            <w:pPr>
+              <w:spacing w:before="20" w:after="20"/>
+            </w:pPr>
+            <w:r>
+              <w:rPr>
+                <w:sz w:val="18"/>
+              </w:rPr>
+              <w:t>10</w:t>
+            </w:r>
+          </w:p>
+        </w:tc>
+        <w:tc>
+          <w:tcPr>
+            <w:tcW w:type="dxa" w:w="3120"/>
+          </w:tcPr>
+          <w:p>
+            <w:pPr>
+              <w:spacing w:before="20" w:after="20"/>
+            </w:pPr>
+            <w:r>
+              <w:rPr>
+                <w:sz w:val="18"/>
+              </w:rPr>
+              <w:t>No PENDING/IN_PROGRESS tasks</w:t>
+            </w:r>
+          </w:p>
+        </w:tc>
+      </w:tr>
+      <w:tr>
+        <w:tc>
+          <w:tcPr>
+            <w:tcW w:type="dxa" w:w="3120"/>
+          </w:tcPr>
+          <w:p>
+            <w:pPr>
+              <w:spacing w:before="20" w:after="20"/>
+            </w:pPr>
+            <w:r>
+              <w:rPr>
+                <w:sz w:val="18"/>
+              </w:rPr>
+              <w:t>Referrals resolved</w:t>
+            </w:r>
+          </w:p>
+        </w:tc>
+        <w:tc>
+          <w:tcPr>
+            <w:tcW w:type="dxa" w:w="3120"/>
+          </w:tcPr>
+          <w:p>
+            <w:pPr>
+              <w:spacing w:before="20" w:after="20"/>
+            </w:pPr>
+            <w:r>
+              <w:rPr>
+                <w:sz w:val="18"/>
+              </w:rPr>
+              <w:t>5</w:t>
+            </w:r>
+          </w:p>
+        </w:tc>
+        <w:tc>
+          <w:tcPr>
+            <w:tcW w:type="dxa" w:w="3120"/>
+          </w:tcPr>
+          <w:p>
+            <w:pPr>
+              <w:spacing w:before="20" w:after="20"/>
+            </w:pPr>
+            <w:r>
+              <w:rPr>
+                <w:sz w:val="18"/>
+              </w:rPr>
+              <w:t>No PENDING referrals</w:t>
+            </w:r>
+          </w:p>
+        </w:tc>
+      </w:tr>
+      <w:tr>
+        <w:tc>
+          <w:tcPr>
+            <w:tcW w:type="dxa" w:w="3120"/>
+          </w:tcPr>
+          <w:p>
+            <w:pPr>
+              <w:spacing w:before="20" w:after="20"/>
+            </w:pPr>
+            <w:r>
+              <w:rPr>
+                <w:sz w:val="18"/>
+              </w:rPr>
+              <w:t>Techniques logged</w:t>
+            </w:r>
+          </w:p>
+        </w:tc>
+        <w:tc>
+          <w:tcPr>
+            <w:tcW w:type="dxa" w:w="3120"/>
+          </w:tcPr>
+          <w:p>
+            <w:pPr>
+              <w:spacing w:before="20" w:after="20"/>
+            </w:pPr>
+            <w:r>
+              <w:rPr>
+                <w:sz w:val="18"/>
+              </w:rPr>
+              <w:t>5</w:t>
+            </w:r>
+          </w:p>
+        </w:tc>
+        <w:tc>
+          <w:tcPr>
+            <w:tcW w:type="dxa" w:w="3120"/>
+          </w:tcPr>
+          <w:p>
+            <w:pPr>
+              <w:spacing w:before="20" w:after="20"/>
+            </w:pPr>
+            <w:r>
+              <w:rPr>
+                <w:sz w:val="18"/>
+              </w:rPr>
+              <w:t>≥1 InvestigativeTechnique</w:t>
+            </w:r>
+          </w:p>
+        </w:tc>
+      </w:tr>
+      <w:tr>
+        <w:tc>
+          <w:tcPr>
+            <w:tcW w:type="dxa" w:w="3120"/>
+          </w:tcPr>
+          <w:p>
+            <w:pPr>
+              <w:spacing w:before="20" w:after="20"/>
+            </w:pPr>
+            <w:r>
+              <w:rPr>
+                <w:sz w:val="18"/>
+              </w:rPr>
+              <w:t>Case notes &gt;3</w:t>
+            </w:r>
+          </w:p>
+        </w:tc>
+        <w:tc>
+          <w:tcPr>
+            <w:tcW w:type="dxa" w:w="3120"/>
+          </w:tcPr>
+          <w:p>
+            <w:pPr>
+              <w:spacing w:before="20" w:after="20"/>
+            </w:pPr>
+            <w:r>
+              <w:rPr>
+                <w:sz w:val="18"/>
+              </w:rPr>
+              <w:t>5</w:t>
+            </w:r>
+          </w:p>
+        </w:tc>
+        <w:tc>
+          <w:tcPr>
+            <w:tcW w:type="dxa" w:w="3120"/>
+          </w:tcPr>
+          <w:p>
+            <w:pPr>
+              <w:spacing w:before="20" w:after="20"/>
+            </w:pPr>
+            <w:r>
+              <w:rPr>
+                <w:sz w:val="18"/>
+              </w:rPr>
+              <w:t>At least 3 CaseNotes</w:t>
+            </w:r>
+          </w:p>
+        </w:tc>
+      </w:tr>
+      <w:tr>
+        <w:tc>
+          <w:tcPr>
+            <w:tcW w:type="dxa" w:w="3120"/>
+          </w:tcPr>
+          <w:p>
+            <w:pPr>
+              <w:spacing w:before="20" w:after="20"/>
+            </w:pPr>
+            <w:r>
+              <w:rPr>
+                <w:sz w:val="18"/>
+              </w:rPr>
+              <w:t>Supervisor review</w:t>
+            </w:r>
+          </w:p>
+        </w:tc>
+        <w:tc>
+          <w:tcPr>
+            <w:tcW w:type="dxa" w:w="3120"/>
+          </w:tcPr>
+          <w:p>
+            <w:pPr>
+              <w:spacing w:before="20" w:after="20"/>
+            </w:pPr>
+            <w:r>
+              <w:rPr>
+                <w:sz w:val="18"/>
+              </w:rPr>
+              <w:t>5</w:t>
+            </w:r>
+          </w:p>
+        </w:tc>
+        <w:tc>
+          <w:tcPr>
+            <w:tcW w:type="dxa" w:w="3120"/>
+          </w:tcPr>
+          <w:p>
+            <w:pPr>
+              <w:spacing w:before="20" w:after="20"/>
+            </w:pPr>
+            <w:r>
+              <w:rPr>
+                <w:sz w:val="18"/>
+              </w:rPr>
+              <w:t>Any workflow with COMPLETED status</w:t>
+            </w:r>
+          </w:p>
+        </w:tc>
+      </w:tr>
+      <w:tr>
+        <w:tc>
+          <w:tcPr>
+            <w:tcW w:type="dxa" w:w="3120"/>
+          </w:tcPr>
+          <w:p>
+            <w:pPr>
+              <w:spacing w:before="20" w:after="20"/>
+            </w:pPr>
+            <w:r>
+              <w:rPr>
+                <w:sz w:val="18"/>
+              </w:rPr>
+              <w:t>Checklist items done</w:t>
+            </w:r>
+          </w:p>
+        </w:tc>
+        <w:tc>
+          <w:tcPr>
+            <w:tcW w:type="dxa" w:w="3120"/>
+          </w:tcPr>
+          <w:p>
+            <w:pPr>
+              <w:spacing w:before="20" w:after="20"/>
+            </w:pPr>
+            <w:r>
+              <w:rPr>
+                <w:sz w:val="18"/>
+              </w:rPr>
+              <w:t>10</w:t>
+            </w:r>
+          </w:p>
+        </w:tc>
+        <w:tc>
+          <w:tcPr>
+            <w:tcW w:type="dxa" w:w="3120"/>
+          </w:tcPr>
+          <w:p>
+            <w:pPr>
+              <w:spacing w:before="20" w:after="20"/>
+            </w:pPr>
+            <w:r>
+              <w:rPr>
+                <w:sz w:val="18"/>
+              </w:rPr>
+              <w:t>All required CloseChecklist items completed</w:t>
+            </w:r>
+          </w:p>
+        </w:tc>
+      </w:tr>
+      <w:tr>
+        <w:tc>
+          <w:tcPr>
+            <w:tcW w:type="dxa" w:w="3120"/>
+          </w:tcPr>
+          <w:p>
+            <w:pPr>
+              <w:spacing w:before="20" w:after="20"/>
+            </w:pPr>
+            <w:r>
+              <w:rPr>
+                <w:sz w:val="18"/>
+              </w:rPr>
+              <w:t>Documents &gt;2</w:t>
+            </w:r>
+          </w:p>
+        </w:tc>
+        <w:tc>
+          <w:tcPr>
+            <w:tcW w:type="dxa" w:w="3120"/>
+          </w:tcPr>
+          <w:p>
+            <w:pPr>
+              <w:spacing w:before="20" w:after="20"/>
+            </w:pPr>
+            <w:r>
+              <w:rPr>
+                <w:sz w:val="18"/>
+              </w:rPr>
+              <w:t>5</w:t>
+            </w:r>
+          </w:p>
+        </w:tc>
+        <w:tc>
+          <w:tcPr>
+            <w:tcW w:type="dxa" w:w="3120"/>
+          </w:tcPr>
+          <w:p>
+            <w:pPr>
+              <w:spacing w:before="20" w:after="20"/>
+            </w:pPr>
+            <w:r>
+              <w:rPr>
+                <w:sz w:val="18"/>
+              </w:rPr>
+              <w:t>At least 2 Documents</w:t>
+            </w:r>
+          </w:p>
+        </w:tc>
+      </w:tr>
+      <w:tr>
+        <w:tc>
+          <w:tcPr>
+            <w:tcW w:type="dxa" w:w="3120"/>
+          </w:tcPr>
+          <w:p>
+            <w:pPr>
+              <w:spacing w:before="20" w:after="20"/>
+            </w:pPr>
+            <w:r>
+              <w:rPr>
+                <w:sz w:val="18"/>
+              </w:rPr>
+              <w:t>No pending workflows</w:t>
+            </w:r>
+          </w:p>
+        </w:tc>
+        <w:tc>
+          <w:tcPr>
+            <w:tcW w:type="dxa" w:w="3120"/>
+          </w:tcPr>
+          <w:p>
+            <w:pPr>
+              <w:spacing w:before="20" w:after="20"/>
+            </w:pPr>
+            <w:r>
+              <w:rPr>
+                <w:sz w:val="18"/>
+              </w:rPr>
+              <w:t>5</w:t>
+            </w:r>
+          </w:p>
+        </w:tc>
+        <w:tc>
+          <w:tcPr>
+            <w:tcW w:type="dxa" w:w="3120"/>
+          </w:tcPr>
+          <w:p>
+            <w:pPr>
+              <w:spacing w:before="20" w:after="20"/>
+            </w:pPr>
+            <w:r>
+              <w:rPr>
+                <w:sz w:val="18"/>
+              </w:rPr>
+              <w:t>No ACTIVE WorkflowInstances</w:t>
             </w:r>
           </w:p>
         </w:tc>
@@ -9968,9 +9540,1059 @@
         <w:spacing w:after="80"/>
       </w:pPr>
       <w:r>
-        <w:t>All Claude-powered features use the claude-sonnet-4-20250514 model via the @anthropic-ai/sdk client (src/lib/ai/claude-client.ts) with a 30-second timeout.</w:t>
+        <w:t>Score ≥80 = ready to close. Returns score, ready boolean, and list of missing items.</w:t>
       </w:r>
     </w:p>
+    <w:p>
+      <w:pPr>
+        <w:pStyle w:val="Heading2"/>
+      </w:pPr>
+      <w:r>
+        <w:t>6.13 Complaint Deduplication (`src/lib/ai/complaint-dedup.ts`)</w:t>
+      </w:r>
+    </w:p>
+    <w:p>
+      <w:pPr>
+        <w:spacing w:after="80"/>
+      </w:pPr>
+      <w:r>
+        <w:t>SOW: EF15, HWC1 | Endpoint: POST /api/ai/complaint-dedup</w:t>
+      </w:r>
+    </w:p>
+    <w:p>
+      <w:pPr>
+        <w:spacing w:after="80"/>
+      </w:pPr>
+      <w:r>
+        <w:t>Detects when a new complaint duplicates an existing inquiry or open case:</w:t>
+      </w:r>
+    </w:p>
+    <w:p>
+      <w:pPr>
+        <w:pStyle w:val="ListBullet"/>
+        <w:spacing w:before="20" w:after="20"/>
+      </w:pPr>
+      <w:r>
+        <w:t>Subject Matching (60% weight): Levenshtein distance on complaint subject text (imported from entity-resolution.ts). Distance normalized to 0–1 similarity.</w:t>
+      </w:r>
+    </w:p>
+    <w:p>
+      <w:pPr>
+        <w:pStyle w:val="ListBullet"/>
+        <w:spacing w:before="20" w:after="20"/>
+      </w:pPr>
+      <w:r>
+        <w:t>Keyword Overlap (40% weight): Tokenizes both descriptions, computes Jaccard similarity coefficient (intersection / union of keyword sets).</w:t>
+      </w:r>
+    </w:p>
+    <w:p>
+      <w:pPr>
+        <w:pStyle w:val="ListBullet"/>
+        <w:spacing w:before="20" w:after="20"/>
+      </w:pPr>
+      <w:r>
+        <w:t>Combined Score: Weighted average, threshold at 0.3 for reporting.</w:t>
+      </w:r>
+    </w:p>
+    <w:p>
+      <w:pPr>
+        <w:pStyle w:val="ListBullet"/>
+        <w:spacing w:before="20" w:after="20"/>
+      </w:pPr>
+      <w:r>
+        <w:t>Cross-entity: Compares against both PreliminaryInquiry (last 90 days) and open Case records.</w:t>
+      </w:r>
+    </w:p>
+    <w:p>
+      <w:pPr>
+        <w:pStyle w:val="ListBullet"/>
+        <w:spacing w:before="20" w:after="20"/>
+      </w:pPr>
+      <w:r>
+        <w:t>Integration: Auto-runs on every hotline submission. Potential duplicates included in response as potentialDuplicates.</w:t>
+      </w:r>
+    </w:p>
+    <w:p>
+      <w:pPr>
+        <w:pStyle w:val="Heading2"/>
+      </w:pPr>
+      <w:r>
+        <w:t>6.14 Workload Balancing (`src/lib/ai/workload-balancing.ts`)</w:t>
+      </w:r>
+    </w:p>
+    <w:p>
+      <w:pPr>
+        <w:spacing w:after="80"/>
+      </w:pPr>
+      <w:r>
+        <w:t>SOW: RRS23, C17 | Endpoint: GET /api/ai/workload</w:t>
+      </w:r>
+    </w:p>
+    <w:p>
+      <w:pPr>
+        <w:spacing w:after="80"/>
+      </w:pPr>
+      <w:r>
+        <w:t>Per-investigator workload analysis with team-level balancing:</w:t>
+      </w:r>
+    </w:p>
+    <w:p>
+      <w:pPr>
+        <w:pStyle w:val="ListBullet"/>
+        <w:spacing w:before="20" w:after="20"/>
+      </w:pPr>
+      <w:r>
+        <w:t>Workload Score: Weighted sum of: active cases (×3), critical cases (×5), pending tasks (×1), overdue tasks (×4), cases due this week (×3).</w:t>
+      </w:r>
+    </w:p>
+    <w:p>
+      <w:pPr>
+        <w:pStyle w:val="ListBullet"/>
+        <w:spacing w:before="20" w:after="20"/>
+      </w:pPr>
+      <w:r>
+        <w:t>Statistical Thresholds: Calculates team mean and standard deviation. Overloaded = score &gt; mean + 1.5σ. Underloaded = score &lt; mean - 1σ.</w:t>
+      </w:r>
+    </w:p>
+    <w:p>
+      <w:pPr>
+        <w:pStyle w:val="ListBullet"/>
+        <w:spacing w:before="20" w:after="20"/>
+      </w:pPr>
+      <w:r>
+        <w:t>Supervisor Queues: Counts pending approval workflow steps per supervisor.</w:t>
+      </w:r>
+    </w:p>
+    <w:p>
+      <w:pPr>
+        <w:pStyle w:val="ListBullet"/>
+        <w:spacing w:before="20" w:after="20"/>
+      </w:pPr>
+      <w:r>
+        <w:t>Output: Per-investigator breakdown, overloaded/underloaded flags, team average, supervisor queue depths.</w:t>
+      </w:r>
+    </w:p>
+    <w:p>
+      <w:pPr>
+        <w:pStyle w:val="Heading2"/>
+      </w:pPr>
+      <w:r>
+        <w:t>6.15 Financial Pattern Mining (`src/lib/ai/financial-patterns.ts`)</w:t>
+      </w:r>
+    </w:p>
+    <w:p>
+      <w:pPr>
+        <w:spacing w:after="80"/>
+      </w:pPr>
+      <w:r>
+        <w:t>SOW: FC1, RRS24 | Endpoint: GET /api/ai/financial-patterns</w:t>
+      </w:r>
+    </w:p>
+    <w:p>
+      <w:pPr>
+        <w:spacing w:after="80"/>
+      </w:pPr>
+      <w:r>
+        <w:t>Detects suspicious patterns in financial results:</w:t>
+      </w:r>
+    </w:p>
+    <w:p>
+      <w:pPr>
+        <w:pStyle w:val="ListBullet"/>
+        <w:spacing w:before="20" w:after="20"/>
+      </w:pPr>
+      <w:r>
+        <w:t>Round Numbers: Flags amounts that are exact multiples of $10K, $50K, or $100K (may indicate fabricated figures).</w:t>
+      </w:r>
+    </w:p>
+    <w:p>
+      <w:pPr>
+        <w:pStyle w:val="ListBullet"/>
+        <w:spacing w:before="20" w:after="20"/>
+      </w:pPr>
+      <w:r>
+        <w:t>Just-Below-Threshold: Flags amounts like $9,999.99 that fall just under common reporting thresholds.</w:t>
+      </w:r>
+    </w:p>
+    <w:p>
+      <w:pPr>
+        <w:pStyle w:val="ListBullet"/>
+        <w:spacing w:before="20" w:after="20"/>
+      </w:pPr>
+      <w:r>
+        <w:t>Sequential/Clustered Amounts: Detects multiple results from the same subject with suspiciously similar amounts.</w:t>
+      </w:r>
+    </w:p>
+    <w:p>
+      <w:pPr>
+        <w:pStyle w:val="ListBullet"/>
+        <w:spacing w:before="20" w:after="20"/>
+      </w:pPr>
+      <w:r>
+        <w:t>Outliers (IQR-based): Calculates interquartile range. Amounts below Q1-1.5×IQR or above Q3+1.5×IQR are flagged.</w:t>
+      </w:r>
+    </w:p>
+    <w:p>
+      <w:pPr>
+        <w:pStyle w:val="ListBullet"/>
+        <w:spacing w:before="20" w:after="20"/>
+      </w:pPr>
+      <w:r>
+        <w:t>Weekend/Holiday Dates: Results with resultDate on Saturday or Sunday.</w:t>
+      </w:r>
+    </w:p>
+    <w:p>
+      <w:pPr>
+        <w:pStyle w:val="Heading2"/>
+      </w:pPr>
+      <w:r>
+        <w:t>6.16 Subject Risk Profiling (`src/lib/ai/subject-risk.ts`)</w:t>
+      </w:r>
+    </w:p>
+    <w:p>
+      <w:pPr>
+        <w:spacing w:after="80"/>
+      </w:pPr>
+      <w:r>
+        <w:t>SOW: CM8, CM49 | Endpoint: GET /api/ai/subject-risk</w:t>
+      </w:r>
+    </w:p>
+    <w:p>
+      <w:pPr>
+        <w:spacing w:after="80"/>
+      </w:pPr>
+      <w:r>
+        <w:t>Multi-factor 0–100 risk scoring per subject:</w:t>
+      </w:r>
+    </w:p>
+    <w:p>
+      <w:pPr>
+        <w:pStyle w:val="ListBullet"/>
+        <w:spacing w:before="20" w:after="20"/>
+      </w:pPr>
+      <w:r>
+        <w:t>Case Involvement: +5 per case linked.</w:t>
+      </w:r>
+    </w:p>
+    <w:p>
+      <w:pPr>
+        <w:pStyle w:val="ListBullet"/>
+        <w:spacing w:before="20" w:after="20"/>
+      </w:pPr>
+      <w:r>
+        <w:t>Violations: +10 per violation, +20 if status is SUBSTANTIATED.</w:t>
+      </w:r>
+    </w:p>
+    <w:p>
+      <w:pPr>
+        <w:pStyle w:val="ListBullet"/>
+        <w:spacing w:before="20" w:after="20"/>
+      </w:pPr>
+      <w:r>
+        <w:t>Financial Impact (log scale): $1K=+5, $10K=+10, $100K=+15, $1M+=+25.</w:t>
+      </w:r>
+    </w:p>
+    <w:p>
+      <w:pPr>
+        <w:pStyle w:val="ListBullet"/>
+        <w:spacing w:before="20" w:after="20"/>
+      </w:pPr>
+      <w:r>
+        <w:t>Network Hub Score: Higher score for subjects with many connections (from network analysis).</w:t>
+      </w:r>
+    </w:p>
+    <w:p>
+      <w:pPr>
+        <w:pStyle w:val="ListBullet"/>
+        <w:spacing w:before="20" w:after="20"/>
+      </w:pPr>
+      <w:r>
+        <w:t>Repeat Offender: +15 if subject appears in &gt;2 cases.</w:t>
+      </w:r>
+    </w:p>
+    <w:p>
+      <w:pPr>
+        <w:pStyle w:val="ListBullet"/>
+        <w:spacing w:before="20" w:after="20"/>
+      </w:pPr>
+      <w:r>
+        <w:t>Role Escalation: +10 if subject's role was upgraded (e.g., WITNESS → RESPONDENT across cases).</w:t>
+      </w:r>
+    </w:p>
+    <w:p>
+      <w:pPr>
+        <w:pStyle w:val="ListBullet"/>
+        <w:spacing w:before="20" w:after="20"/>
+      </w:pPr>
+      <w:r>
+        <w:t>Risk Levels: CRITICAL (80+), HIGH (60+), MEDIUM (40+), LOW (&lt;40).</w:t>
+      </w:r>
+    </w:p>
+    <w:p>
+      <w:pPr>
+        <w:pStyle w:val="Heading2"/>
+      </w:pPr>
+      <w:r>
+        <w:t>6.17 Automated Case Narrative (`src/lib/ai/case-narrative.ts`)</w:t>
+      </w:r>
+    </w:p>
+    <w:p>
+      <w:pPr>
+        <w:spacing w:after="80"/>
+      </w:pPr>
+      <w:r>
+        <w:t>SOW: RRS16, CM34 | Endpoint: GET /api/ai/case-narrative?caseId=</w:t>
+      </w:r>
+    </w:p>
+    <w:p>
+      <w:pPr>
+        <w:spacing w:after="80"/>
+      </w:pPr>
+      <w:r>
+        <w:t>Generates structured plain-English investigation summary from case data:</w:t>
+      </w:r>
+    </w:p>
+    <w:p>
+      <w:pPr>
+        <w:pStyle w:val="ListBullet"/>
+        <w:spacing w:before="20" w:after="20"/>
+      </w:pPr>
+      <w:r>
+        <w:t>Opening: "Case [number] is a [type] investigation opened on [date] involving [N] subjects."</w:t>
+      </w:r>
+    </w:p>
+    <w:p>
+      <w:pPr>
+        <w:pStyle w:val="ListBullet"/>
+        <w:spacing w:before="20" w:after="20"/>
+      </w:pPr>
+      <w:r>
+        <w:t>Subjects: Lists all linked subjects with roles and types.</w:t>
+      </w:r>
+    </w:p>
+    <w:p>
+      <w:pPr>
+        <w:pStyle w:val="ListBullet"/>
+        <w:spacing w:before="20" w:after="20"/>
+      </w:pPr>
+      <w:r>
+        <w:t>Investigation: Summarizes techniques employed with dates and findings.</w:t>
+      </w:r>
+    </w:p>
+    <w:p>
+      <w:pPr>
+        <w:pStyle w:val="ListBullet"/>
+        <w:spacing w:before="20" w:after="20"/>
+      </w:pPr>
+      <w:r>
+        <w:t>Violations: Lists documented violations with status and disposition.</w:t>
+      </w:r>
+    </w:p>
+    <w:p>
+      <w:pPr>
+        <w:pStyle w:val="ListBullet"/>
+        <w:spacing w:before="20" w:after="20"/>
+      </w:pPr>
+      <w:r>
+        <w:t>Financial Impact: Totals recoveries, fines, restitution, savings with per-subject breakdown.</w:t>
+      </w:r>
+    </w:p>
+    <w:p>
+      <w:pPr>
+        <w:pStyle w:val="ListBullet"/>
+        <w:spacing w:before="20" w:after="20"/>
+      </w:pPr>
+      <w:r>
+        <w:t>Referrals: Lists agency referrals with status and outcomes.</w:t>
+      </w:r>
+    </w:p>
+    <w:p>
+      <w:pPr>
+        <w:pStyle w:val="ListBullet"/>
+        <w:spacing w:before="20" w:after="20"/>
+      </w:pPr>
+      <w:r>
+        <w:t>Status: Current case status with closure readiness score.</w:t>
+      </w:r>
+    </w:p>
+    <w:p>
+      <w:pPr>
+        <w:pStyle w:val="Heading2"/>
+      </w:pPr>
+      <w:r>
+        <w:t>6.18 Case Clustering (via `src/lib/ai/case-similarity.ts`)</w:t>
+      </w:r>
+    </w:p>
+    <w:p>
+      <w:pPr>
+        <w:spacing w:after="80"/>
+      </w:pPr>
+      <w:r>
+        <w:t>SOW: RRS11 | Endpoint: GET /api/ai/clusters | Cache: 10 min</w:t>
+      </w:r>
+    </w:p>
+    <w:p>
+      <w:pPr>
+        <w:spacing w:after="80"/>
+      </w:pPr>
+      <w:r>
+        <w:t>K-means clustering algorithm grouping all active cases into 5 clusters:</w:t>
+      </w:r>
+    </w:p>
+    <w:p>
+      <w:pPr>
+        <w:pStyle w:val="ListBullet"/>
+        <w:spacing w:before="20" w:after="20"/>
+      </w:pPr>
+      <w:r>
+        <w:t>Feature Vectors: Same 22-dimensional vectors as similarity (case type one-hot, priority ordinal, complaint source one-hot, numeric counts).</w:t>
+      </w:r>
+    </w:p>
+    <w:p>
+      <w:pPr>
+        <w:pStyle w:val="ListBullet"/>
+        <w:spacing w:before="20" w:after="20"/>
+      </w:pPr>
+      <w:r>
+        <w:t>Algorithm: Random centroid initialization, iterative assignment/update until convergence or 100 iterations. Euclidean distance metric.</w:t>
+      </w:r>
+    </w:p>
+    <w:p>
+      <w:pPr>
+        <w:pStyle w:val="ListBullet"/>
+        <w:spacing w:before="20" w:after="20"/>
+      </w:pPr>
+      <w:r>
+        <w:t>Output: Cluster ID, label (most common type + source), case count, member case IDs.</w:t>
+      </w:r>
+    </w:p>
+    <w:p>
+      <w:pPr>
+        <w:pStyle w:val="Heading2"/>
+      </w:pPr>
+      <w:r>
+        <w:t>6.19–6.22 Claude LLM-Powered Endpoints</w:t>
+      </w:r>
+    </w:p>
+    <w:p>
+      <w:pPr>
+        <w:spacing w:after="80"/>
+      </w:pPr>
+      <w:r>
+        <w:t>All Claude-powered features use the claude-sonnet-4-20250514 model via @anthropic-ai/sdk client (src/lib/ai/claude-client.ts) with a 30-second timeout. The API key is configured in .env.local as ANTHROPIC_API_KEY.</w:t>
+      </w:r>
+    </w:p>
+    <w:p>
+      <w:pPr>
+        <w:pStyle w:val="Heading3"/>
+      </w:pPr>
+      <w:r>
+        <w:t>6.19 Natural Language Search</w:t>
+      </w:r>
+    </w:p>
+    <w:p>
+      <w:pPr>
+        <w:spacing w:after="80"/>
+      </w:pPr>
+      <w:r>
+        <w:t>Endpoint: POST /api/ai/natural-search</w:t>
+      </w:r>
+    </w:p>
+    <w:p>
+      <w:pPr>
+        <w:pStyle w:val="ListBullet"/>
+        <w:spacing w:before="20" w:after="20"/>
+      </w:pPr>
+      <w:r>
+        <w:t>Input: { query: "Show me all fraud cases from 2025 with recoveries over $500K" }</w:t>
+      </w:r>
+    </w:p>
+    <w:p>
+      <w:pPr>
+        <w:pStyle w:val="ListBullet"/>
+        <w:spacing w:before="20" w:after="20"/>
+      </w:pPr>
+      <w:r>
+        <w:t>Process: Claude translates the natural language query into a structured JSON filter with fields: status, caseType, priority, dateFrom, dateTo, search, minAmount.</w:t>
+      </w:r>
+    </w:p>
+    <w:p>
+      <w:pPr>
+        <w:pStyle w:val="ListBullet"/>
+        <w:spacing w:before="20" w:after="20"/>
+      </w:pPr>
+      <w:r>
+        <w:t>Execution: The parsed filters are applied as Prisma where clauses against the Case model with RBAC access filters.</w:t>
+      </w:r>
+    </w:p>
+    <w:p>
+      <w:pPr>
+        <w:pStyle w:val="ListBullet"/>
+        <w:spacing w:before="20" w:after="20"/>
+      </w:pPr>
+      <w:r>
+        <w:t>Output: { query, filters, results, resultCount }</w:t>
+      </w:r>
+    </w:p>
+    <w:p>
+      <w:pPr>
+        <w:pStyle w:val="Heading3"/>
+      </w:pPr>
+      <w:r>
+        <w:t>6.20 Document Content Analysis</w:t>
+      </w:r>
+    </w:p>
+    <w:p>
+      <w:pPr>
+        <w:spacing w:after="80"/>
+      </w:pPr>
+      <w:r>
+        <w:t>Endpoint: POST /api/ai/analyze-document</w:t>
+      </w:r>
+    </w:p>
+    <w:p>
+      <w:pPr>
+        <w:pStyle w:val="ListBullet"/>
+        <w:spacing w:before="20" w:after="20"/>
+      </w:pPr>
+      <w:r>
+        <w:t>Input: { title, content } — document title and text content.</w:t>
+      </w:r>
+    </w:p>
+    <w:p>
+      <w:pPr>
+        <w:pStyle w:val="ListBullet"/>
+        <w:spacing w:before="20" w:after="20"/>
+      </w:pPr>
+      <w:r>
+        <w:t>Process: Claude analyzes the text and extracts structured intelligence.</w:t>
+      </w:r>
+    </w:p>
+    <w:p>
+      <w:pPr>
+        <w:pStyle w:val="ListBullet"/>
+        <w:spacing w:before="20" w:after="20"/>
+      </w:pPr>
+      <w:r>
+        <w:t>Output: { keyFacts, entities, redFlags, classification, recommendedActions, summary }</w:t>
+      </w:r>
+    </w:p>
+    <w:p>
+      <w:pPr>
+        <w:pStyle w:val="Heading3"/>
+      </w:pPr>
+      <w:r>
+        <w:t>6.21 Interview Question Generator</w:t>
+      </w:r>
+    </w:p>
+    <w:p>
+      <w:pPr>
+        <w:spacing w:after="80"/>
+      </w:pPr>
+      <w:r>
+        <w:t>Endpoint: POST /api/ai/interview-questions</w:t>
+      </w:r>
+    </w:p>
+    <w:p>
+      <w:pPr>
+        <w:pStyle w:val="ListBullet"/>
+        <w:spacing w:before="20" w:after="20"/>
+      </w:pPr>
+      <w:r>
+        <w:t>Input: { caseType, subjectRole, subjectName?, caseDescription?, knownFacts? }</w:t>
+      </w:r>
+    </w:p>
+    <w:p>
+      <w:pPr>
+        <w:pStyle w:val="ListBullet"/>
+        <w:spacing w:before="20" w:after="20"/>
+      </w:pPr>
+      <w:r>
+        <w:t>Process: Claude generates role-appropriate questions considering the investigation type and subject's relationship to the case.</w:t>
+      </w:r>
+    </w:p>
+    <w:p>
+      <w:pPr>
+        <w:pStyle w:val="ListBullet"/>
+        <w:spacing w:before="20" w:after="20"/>
+      </w:pPr>
+      <w:r>
+        <w:t>Output: { openingQuestions, substantiveQuestions, probeQuestions, closingQuestions, interviewTips }</w:t>
+      </w:r>
+    </w:p>
+    <w:p>
+      <w:pPr>
+        <w:pStyle w:val="Heading3"/>
+      </w:pPr>
+      <w:r>
+        <w:t>6.22 Smart Report Generation</w:t>
+      </w:r>
+    </w:p>
+    <w:p>
+      <w:pPr>
+        <w:spacing w:after="80"/>
+      </w:pPr>
+      <w:r>
+        <w:t>Endpoint: POST /api/ai/generate-report</w:t>
+      </w:r>
+    </w:p>
+    <w:p>
+      <w:pPr>
+        <w:pStyle w:val="ListBullet"/>
+        <w:spacing w:before="20" w:after="20"/>
+      </w:pPr>
+      <w:r>
+        <w:t>Input: { caseId, reportType: "summary"|"narrative"|"findings"|"recommendation" }</w:t>
+      </w:r>
+    </w:p>
+    <w:p>
+      <w:pPr>
+        <w:pStyle w:val="ListBullet"/>
+        <w:spacing w:before="20" w:after="20"/>
+      </w:pPr>
+      <w:r>
+        <w:t>Process: Fetches complete case data (subjects, violations, financials, techniques, referrals, notes, evidence, assignments), sends to Claude with report-type-specific instructions.</w:t>
+      </w:r>
+    </w:p>
+    <w:p>
+      <w:pPr>
+        <w:pStyle w:val="ListBullet"/>
+        <w:spacing w:before="20" w:after="20"/>
+      </w:pPr>
+      <w:r>
+        <w:t>Output: { report, wordCount, sections }</w:t>
+      </w:r>
+    </w:p>
+    <w:p>
+      <w:pPr>
+        <w:pStyle w:val="Heading2"/>
+      </w:pPr>
+      <w:r>
+        <w:t>AI Dashboard UI</w:t>
+      </w:r>
+    </w:p>
+    <w:p>
+      <w:pPr>
+        <w:spacing w:after="80"/>
+      </w:pPr>
+      <w:r>
+        <w:t>All 22 algorithms are accessible through the AI Insights Dashboard (/dashboard/ai) organized in 7 tabs:</w:t>
+      </w:r>
+    </w:p>
+    <w:tbl>
+      <w:tblPr>
+        <w:tblStyle w:val="LightGrid-Accent1"/>
+        <w:tblW w:type="auto" w:w="0"/>
+        <w:jc w:val="left"/>
+        <w:tblLook w:firstColumn="1" w:firstRow="1" w:lastColumn="0" w:lastRow="0" w:noHBand="0" w:noVBand="1" w:val="04A0"/>
+      </w:tblPr>
+      <w:tblGrid>
+        <w:gridCol w:w="3120"/>
+        <w:gridCol w:w="3120"/>
+        <w:gridCol w:w="3120"/>
+      </w:tblGrid>
+      <w:tr>
+        <w:tc>
+          <w:tcPr>
+            <w:tcW w:type="dxa" w:w="3120"/>
+          </w:tcPr>
+          <w:p>
+            <w:pPr>
+              <w:spacing w:before="20" w:after="20"/>
+            </w:pPr>
+            <w:r>
+              <w:rPr>
+                <w:sz w:val="18"/>
+              </w:rPr>
+              <w:t>Tab</w:t>
+            </w:r>
+          </w:p>
+        </w:tc>
+        <w:tc>
+          <w:tcPr>
+            <w:tcW w:type="dxa" w:w="3120"/>
+          </w:tcPr>
+          <w:p>
+            <w:pPr>
+              <w:spacing w:before="20" w:after="20"/>
+            </w:pPr>
+            <w:r>
+              <w:rPr>
+                <w:sz w:val="18"/>
+              </w:rPr>
+              <w:t>Algorithms</w:t>
+            </w:r>
+          </w:p>
+        </w:tc>
+        <w:tc>
+          <w:tcPr>
+            <w:tcW w:type="dxa" w:w="3120"/>
+          </w:tcPr>
+          <w:p>
+            <w:pPr>
+              <w:spacing w:before="20" w:after="20"/>
+            </w:pPr>
+            <w:r>
+              <w:rPr>
+                <w:sz w:val="18"/>
+              </w:rPr>
+              <w:t>Interactive Features</w:t>
+            </w:r>
+          </w:p>
+        </w:tc>
+      </w:tr>
+      <w:tr>
+        <w:tc>
+          <w:tcPr>
+            <w:tcW w:type="dxa" w:w="3120"/>
+          </w:tcPr>
+          <w:p>
+            <w:pPr>
+              <w:spacing w:before="20" w:after="20"/>
+            </w:pPr>
+            <w:r>
+              <w:rPr>
+                <w:sz w:val="18"/>
+              </w:rPr>
+              <w:t>Alerts &amp; Anomalies</w:t>
+            </w:r>
+          </w:p>
+        </w:tc>
+        <w:tc>
+          <w:tcPr>
+            <w:tcW w:type="dxa" w:w="3120"/>
+          </w:tcPr>
+          <w:p>
+            <w:pPr>
+              <w:spacing w:before="20" w:after="20"/>
+            </w:pPr>
+            <w:r>
+              <w:rPr>
+                <w:sz w:val="18"/>
+              </w:rPr>
+              <w:t>Anomaly Detection, Auto-Escalation, Financial Patterns</w:t>
+            </w:r>
+          </w:p>
+        </w:tc>
+        <w:tc>
+          <w:tcPr>
+            <w:tcW w:type="dxa" w:w="3120"/>
+          </w:tcPr>
+          <w:p>
+            <w:pPr>
+              <w:spacing w:before="20" w:after="20"/>
+            </w:pPr>
+            <w:r>
+              <w:rPr>
+                <w:sz w:val="18"/>
+              </w:rPr>
+              <w:t>Auto-loaded alerts with severity badges</w:t>
+            </w:r>
+          </w:p>
+        </w:tc>
+      </w:tr>
+      <w:tr>
+        <w:tc>
+          <w:tcPr>
+            <w:tcW w:type="dxa" w:w="3120"/>
+          </w:tcPr>
+          <w:p>
+            <w:pPr>
+              <w:spacing w:before="20" w:after="20"/>
+            </w:pPr>
+            <w:r>
+              <w:rPr>
+                <w:sz w:val="18"/>
+              </w:rPr>
+              <w:t>Case Intelligence</w:t>
+            </w:r>
+          </w:p>
+        </w:tc>
+        <w:tc>
+          <w:tcPr>
+            <w:tcW w:type="dxa" w:w="3120"/>
+          </w:tcPr>
+          <w:p>
+            <w:pPr>
+              <w:spacing w:before="20" w:after="20"/>
+            </w:pPr>
+            <w:r>
+              <w:rPr>
+                <w:sz w:val="18"/>
+              </w:rPr>
+              <w:t>Similarity, Clustering, Narrative, Closure Readiness</w:t>
+            </w:r>
+          </w:p>
+        </w:tc>
+        <w:tc>
+          <w:tcPr>
+            <w:tcW w:type="dxa" w:w="3120"/>
+          </w:tcPr>
+          <w:p>
+            <w:pPr>
+              <w:spacing w:before="20" w:after="20"/>
+            </w:pPr>
+            <w:r>
+              <w:rPr>
+                <w:sz w:val="18"/>
+              </w:rPr>
+              <w:t>Case ID input, similarity bars, readiness gauge</w:t>
+            </w:r>
+          </w:p>
+        </w:tc>
+      </w:tr>
+      <w:tr>
+        <w:tc>
+          <w:tcPr>
+            <w:tcW w:type="dxa" w:w="3120"/>
+          </w:tcPr>
+          <w:p>
+            <w:pPr>
+              <w:spacing w:before="20" w:after="20"/>
+            </w:pPr>
+            <w:r>
+              <w:rPr>
+                <w:sz w:val="18"/>
+              </w:rPr>
+              <w:t>Evidence &amp; Timeline</w:t>
+            </w:r>
+          </w:p>
+        </w:tc>
+        <w:tc>
+          <w:tcPr>
+            <w:tcW w:type="dxa" w:w="3120"/>
+          </w:tcPr>
+          <w:p>
+            <w:pPr>
+              <w:spacing w:before="20" w:after="20"/>
+            </w:pPr>
+            <w:r>
+              <w:rPr>
+                <w:sz w:val="18"/>
+              </w:rPr>
+              <w:t>Evidence Strength, Timeline Anomalies</w:t>
+            </w:r>
+          </w:p>
+        </w:tc>
+        <w:tc>
+          <w:tcPr>
+            <w:tcW w:type="dxa" w:w="3120"/>
+          </w:tcPr>
+          <w:p>
+            <w:pPr>
+              <w:spacing w:before="20" w:after="20"/>
+            </w:pPr>
+            <w:r>
+              <w:rPr>
+                <w:sz w:val="18"/>
+              </w:rPr>
+              <w:t>Case ID input, letter grade display, timeline cards</w:t>
+            </w:r>
+          </w:p>
+        </w:tc>
+      </w:tr>
+      <w:tr>
+        <w:tc>
+          <w:tcPr>
+            <w:tcW w:type="dxa" w:w="3120"/>
+          </w:tcPr>
+          <w:p>
+            <w:pPr>
+              <w:spacing w:before="20" w:after="20"/>
+            </w:pPr>
+            <w:r>
+              <w:rPr>
+                <w:sz w:val="18"/>
+              </w:rPr>
+              <w:t>Subjects &amp; Network</w:t>
+            </w:r>
+          </w:p>
+        </w:tc>
+        <w:tc>
+          <w:tcPr>
+            <w:tcW w:type="dxa" w:w="3120"/>
+          </w:tcPr>
+          <w:p>
+            <w:pPr>
+              <w:spacing w:before="20" w:after="20"/>
+            </w:pPr>
+            <w:r>
+              <w:rPr>
+                <w:sz w:val="18"/>
+              </w:rPr>
+              <w:t>Duplicate Resolution, Network Analysis, Risk Profiling</w:t>
+            </w:r>
+          </w:p>
+        </w:tc>
+        <w:tc>
+          <w:tcPr>
+            <w:tcW w:type="dxa" w:w="3120"/>
+          </w:tcPr>
+          <w:p>
+            <w:pPr>
+              <w:spacing w:before="20" w:after="20"/>
+            </w:pPr>
+            <w:r>
+              <w:rPr>
+                <w:sz w:val="18"/>
+              </w:rPr>
+              <w:t>Confidence bars, fraud ring display, ranked risk list</w:t>
+            </w:r>
+          </w:p>
+        </w:tc>
+      </w:tr>
+      <w:tr>
+        <w:tc>
+          <w:tcPr>
+            <w:tcW w:type="dxa" w:w="3120"/>
+          </w:tcPr>
+          <w:p>
+            <w:pPr>
+              <w:spacing w:before="20" w:after="20"/>
+            </w:pPr>
+            <w:r>
+              <w:rPr>
+                <w:sz w:val="18"/>
+              </w:rPr>
+              <w:t>Workload &amp; Predictions</w:t>
+            </w:r>
+          </w:p>
+        </w:tc>
+        <w:tc>
+          <w:tcPr>
+            <w:tcW w:type="dxa" w:w="3120"/>
+          </w:tcPr>
+          <w:p>
+            <w:pPr>
+              <w:spacing w:before="20" w:after="20"/>
+            </w:pPr>
+            <w:r>
+              <w:rPr>
+                <w:sz w:val="18"/>
+              </w:rPr>
+              <w:t>Investigator Recommender, Workload Balancing, Predictions</w:t>
+            </w:r>
+          </w:p>
+        </w:tc>
+        <w:tc>
+          <w:tcPr>
+            <w:tcW w:type="dxa" w:w="3120"/>
+          </w:tcPr>
+          <w:p>
+            <w:pPr>
+              <w:spacing w:before="20" w:after="20"/>
+            </w:pPr>
+            <w:r>
+              <w:rPr>
+                <w:sz w:val="18"/>
+              </w:rPr>
+              <w:t>Case type/priority form, workload table, forecast chart</w:t>
+            </w:r>
+          </w:p>
+        </w:tc>
+      </w:tr>
+      <w:tr>
+        <w:tc>
+          <w:tcPr>
+            <w:tcW w:type="dxa" w:w="3120"/>
+          </w:tcPr>
+          <w:p>
+            <w:pPr>
+              <w:spacing w:before="20" w:after="20"/>
+            </w:pPr>
+            <w:r>
+              <w:rPr>
+                <w:sz w:val="18"/>
+              </w:rPr>
+              <w:t>Claude AI</w:t>
+            </w:r>
+          </w:p>
+        </w:tc>
+        <w:tc>
+          <w:tcPr>
+            <w:tcW w:type="dxa" w:w="3120"/>
+          </w:tcPr>
+          <w:p>
+            <w:pPr>
+              <w:spacing w:before="20" w:after="20"/>
+            </w:pPr>
+            <w:r>
+              <w:rPr>
+                <w:sz w:val="18"/>
+              </w:rPr>
+              <w:t>Natural Language Search, Interview Questions, Report Gen, Doc Analysis</w:t>
+            </w:r>
+          </w:p>
+        </w:tc>
+        <w:tc>
+          <w:tcPr>
+            <w:tcW w:type="dxa" w:w="3120"/>
+          </w:tcPr>
+          <w:p>
+            <w:pPr>
+              <w:spacing w:before="20" w:after="20"/>
+            </w:pPr>
+            <w:r>
+              <w:rPr>
+                <w:sz w:val="18"/>
+              </w:rPr>
+              <w:t>Text inputs, generated results display</w:t>
+            </w:r>
+          </w:p>
+        </w:tc>
+      </w:tr>
+      <w:tr>
+        <w:tc>
+          <w:tcPr>
+            <w:tcW w:type="dxa" w:w="3120"/>
+          </w:tcPr>
+          <w:p>
+            <w:pPr>
+              <w:spacing w:before="20" w:after="20"/>
+            </w:pPr>
+            <w:r>
+              <w:rPr>
+                <w:sz w:val="18"/>
+              </w:rPr>
+              <w:t>Risk Scoring</w:t>
+            </w:r>
+          </w:p>
+        </w:tc>
+        <w:tc>
+          <w:tcPr>
+            <w:tcW w:type="dxa" w:w="3120"/>
+          </w:tcPr>
+          <w:p>
+            <w:pPr>
+              <w:spacing w:before="20" w:after="20"/>
+            </w:pPr>
+            <w:r>
+              <w:rPr>
+                <w:sz w:val="18"/>
+              </w:rPr>
+              <w:t>Risk Scoring, Complaint Deduplication</w:t>
+            </w:r>
+          </w:p>
+        </w:tc>
+        <w:tc>
+          <w:tcPr>
+            <w:tcW w:type="dxa" w:w="3120"/>
+          </w:tcPr>
+          <w:p>
+            <w:pPr>
+              <w:spacing w:before="20" w:after="20"/>
+            </w:pPr>
+            <w:r>
+              <w:rPr>
+                <w:sz w:val="18"/>
+              </w:rPr>
+              <w:t>Complaint form with factor breakdown, duplicate checker</w:t>
+            </w:r>
+          </w:p>
+        </w:tc>
+      </w:tr>
+    </w:tbl>
+    <w:p/>
     <w:p>
       <w:r>
         <w:t>____________________________________________________________</w:t>

</xml_diff>